<commit_message>
Regenerate all 34 component specification documents
Root PDF and Diagrams/.docx for every component, picking up: SID entity names in the
2.2/2.3 tables now include their ABE/BE suffix (sourced from each component's own
SID_Descriptions.md, which was updated to carry the suffix), 2.4's Aggregate Function
column headers shortened to "L1"/"L2", and the table-row/page-break fix in both the PDF
and docx builders.

Co-Authored-By: Claude Sonnet 5 <noreply@anthropic.com>
</commit_message>
<xml_diff>
--- a/specifications/TMFC001-ProductCatalogManagement/Diagrams/TMFC001_Product_Catalog_Management.docx
+++ b/specifications/TMFC001-ProductCatalogManagement/Diagrams/TMFC001_Product_Catalog_Management.docx
@@ -155,6 +155,9 @@
         </w:tc>
       </w:tr>
       <w:tr>
+        <w:trPr>
+          <w:cantSplit/>
+        </w:trPr>
         <w:tc>
           <w:tcPr>
             <w:tcW w:type="dxa" w:w="2527"/>
@@ -358,6 +361,9 @@
         </w:tc>
       </w:tr>
       <w:tr>
+        <w:trPr>
+          <w:cantSplit/>
+        </w:trPr>
         <w:tc>
           <w:tcPr>
             <w:tcW w:type="dxa" w:w="1404"/>
@@ -404,6 +410,9 @@
         </w:tc>
       </w:tr>
       <w:tr>
+        <w:trPr>
+          <w:cantSplit/>
+        </w:trPr>
         <w:tc>
           <w:tcPr>
             <w:tcW w:type="dxa" w:w="1404"/>
@@ -450,6 +459,9 @@
         </w:tc>
       </w:tr>
       <w:tr>
+        <w:trPr>
+          <w:cantSplit/>
+        </w:trPr>
         <w:tc>
           <w:tcPr>
             <w:tcW w:type="dxa" w:w="1404"/>
@@ -496,6 +508,9 @@
         </w:tc>
       </w:tr>
       <w:tr>
+        <w:trPr>
+          <w:cantSplit/>
+        </w:trPr>
         <w:tc>
           <w:tcPr>
             <w:tcW w:type="dxa" w:w="1404"/>
@@ -542,6 +557,9 @@
         </w:tc>
       </w:tr>
       <w:tr>
+        <w:trPr>
+          <w:cantSplit/>
+        </w:trPr>
         <w:tc>
           <w:tcPr>
             <w:tcW w:type="dxa" w:w="1404"/>
@@ -588,6 +606,9 @@
         </w:tc>
       </w:tr>
       <w:tr>
+        <w:trPr>
+          <w:cantSplit/>
+        </w:trPr>
         <w:tc>
           <w:tcPr>
             <w:tcW w:type="dxa" w:w="1404"/>
@@ -634,6 +655,9 @@
         </w:tc>
       </w:tr>
       <w:tr>
+        <w:trPr>
+          <w:cantSplit/>
+        </w:trPr>
         <w:tc>
           <w:tcPr>
             <w:tcW w:type="dxa" w:w="1404"/>
@@ -680,6 +704,9 @@
         </w:tc>
       </w:tr>
       <w:tr>
+        <w:trPr>
+          <w:cantSplit/>
+        </w:trPr>
         <w:tc>
           <w:tcPr>
             <w:tcW w:type="dxa" w:w="1404"/>
@@ -726,6 +753,9 @@
         </w:tc>
       </w:tr>
       <w:tr>
+        <w:trPr>
+          <w:cantSplit/>
+        </w:trPr>
         <w:tc>
           <w:tcPr>
             <w:tcW w:type="dxa" w:w="1404"/>
@@ -772,6 +802,9 @@
         </w:tc>
       </w:tr>
       <w:tr>
+        <w:trPr>
+          <w:cantSplit/>
+        </w:trPr>
         <w:tc>
           <w:tcPr>
             <w:tcW w:type="dxa" w:w="1404"/>
@@ -818,6 +851,9 @@
         </w:tc>
       </w:tr>
       <w:tr>
+        <w:trPr>
+          <w:cantSplit/>
+        </w:trPr>
         <w:tc>
           <w:tcPr>
             <w:tcW w:type="dxa" w:w="1404"/>
@@ -864,6 +900,9 @@
         </w:tc>
       </w:tr>
       <w:tr>
+        <w:trPr>
+          <w:cantSplit/>
+        </w:trPr>
         <w:tc>
           <w:tcPr>
             <w:tcW w:type="dxa" w:w="1404"/>
@@ -979,7 +1018,7 @@
         </w:tc>
         <w:tc>
           <w:tcPr>
-            <w:tcW w:type="dxa" w:w="1966"/>
+            <w:tcW w:type="dxa" w:w="2153"/>
           </w:tcPr>
           <w:p>
             <w:r/>
@@ -993,7 +1032,7 @@
         </w:tc>
         <w:tc>
           <w:tcPr>
-            <w:tcW w:type="dxa" w:w="2527"/>
+            <w:tcW w:type="dxa" w:w="2340"/>
           </w:tcPr>
           <w:p>
             <w:r/>
@@ -1007,6 +1046,9 @@
         </w:tc>
       </w:tr>
       <w:tr>
+        <w:trPr>
+          <w:cantSplit/>
+        </w:trPr>
         <w:tc>
           <w:tcPr>
             <w:tcW w:type="dxa" w:w="2434"/>
@@ -1014,7 +1056,7 @@
           <w:p>
             <w:r/>
             <w:r>
-              <w:t>Product Offering Specification</w:t>
+              <w:t>Product Offering Specification ABE</w:t>
             </w:r>
           </w:p>
         </w:tc>
@@ -1031,16 +1073,16 @@
         </w:tc>
         <w:tc>
           <w:tcPr>
-            <w:tcW w:type="dxa" w:w="1966"/>
-          </w:tcPr>
-          <w:p>
-            <w:r/>
-            <w:r/>
-          </w:p>
-        </w:tc>
-        <w:tc>
-          <w:tcPr>
-            <w:tcW w:type="dxa" w:w="2527"/>
+            <w:tcW w:type="dxa" w:w="2153"/>
+          </w:tcPr>
+          <w:p>
+            <w:r/>
+            <w:r/>
+          </w:p>
+        </w:tc>
+        <w:tc>
+          <w:tcPr>
+            <w:tcW w:type="dxa" w:w="2340"/>
           </w:tcPr>
           <w:p>
             <w:r/>
@@ -1051,6 +1093,9 @@
         </w:tc>
       </w:tr>
       <w:tr>
+        <w:trPr>
+          <w:cantSplit/>
+        </w:trPr>
         <w:tc>
           <w:tcPr>
             <w:tcW w:type="dxa" w:w="2434"/>
@@ -1058,7 +1103,7 @@
           <w:p>
             <w:r/>
             <w:r>
-              <w:t>Product Specification</w:t>
+              <w:t>Product Specification ABE</w:t>
             </w:r>
           </w:p>
         </w:tc>
@@ -1075,16 +1120,16 @@
         </w:tc>
         <w:tc>
           <w:tcPr>
-            <w:tcW w:type="dxa" w:w="1966"/>
-          </w:tcPr>
-          <w:p>
-            <w:r/>
-            <w:r/>
-          </w:p>
-        </w:tc>
-        <w:tc>
-          <w:tcPr>
-            <w:tcW w:type="dxa" w:w="2527"/>
+            <w:tcW w:type="dxa" w:w="2153"/>
+          </w:tcPr>
+          <w:p>
+            <w:r/>
+            <w:r/>
+          </w:p>
+        </w:tc>
+        <w:tc>
+          <w:tcPr>
+            <w:tcW w:type="dxa" w:w="2340"/>
           </w:tcPr>
           <w:p>
             <w:r/>
@@ -1095,6 +1140,9 @@
         </w:tc>
       </w:tr>
       <w:tr>
+        <w:trPr>
+          <w:cantSplit/>
+        </w:trPr>
         <w:tc>
           <w:tcPr>
             <w:tcW w:type="dxa" w:w="2434"/>
@@ -1102,7 +1150,7 @@
           <w:p>
             <w:r/>
             <w:r>
-              <w:t>Product Configuration</w:t>
+              <w:t>Product Configuration ABE</w:t>
             </w:r>
           </w:p>
         </w:tc>
@@ -1119,18 +1167,18 @@
         </w:tc>
         <w:tc>
           <w:tcPr>
-            <w:tcW w:type="dxa" w:w="1966"/>
-          </w:tcPr>
-          <w:p>
-            <w:r/>
-            <w:r>
-              <w:t>ProductConfigSpec</w:t>
-            </w:r>
-          </w:p>
-        </w:tc>
-        <w:tc>
-          <w:tcPr>
-            <w:tcW w:type="dxa" w:w="2527"/>
+            <w:tcW w:type="dxa" w:w="2153"/>
+          </w:tcPr>
+          <w:p>
+            <w:r/>
+            <w:r>
+              <w:t>ProductConfigSpec BE</w:t>
+            </w:r>
+          </w:p>
+        </w:tc>
+        <w:tc>
+          <w:tcPr>
+            <w:tcW w:type="dxa" w:w="2340"/>
           </w:tcPr>
           <w:p>
             <w:r/>
@@ -1141,6 +1189,9 @@
         </w:tc>
       </w:tr>
       <w:tr>
+        <w:trPr>
+          <w:cantSplit/>
+        </w:trPr>
         <w:tc>
           <w:tcPr>
             <w:tcW w:type="dxa" w:w="2434"/>
@@ -1148,7 +1199,7 @@
           <w:p>
             <w:r/>
             <w:r>
-              <w:t>Product Usage</w:t>
+              <w:t>Product Usage ABE</w:t>
             </w:r>
           </w:p>
         </w:tc>
@@ -1165,18 +1216,18 @@
         </w:tc>
         <w:tc>
           <w:tcPr>
-            <w:tcW w:type="dxa" w:w="1966"/>
-          </w:tcPr>
-          <w:p>
-            <w:r/>
-            <w:r>
-              <w:t>Product Usage Specification</w:t>
-            </w:r>
-          </w:p>
-        </w:tc>
-        <w:tc>
-          <w:tcPr>
-            <w:tcW w:type="dxa" w:w="2527"/>
+            <w:tcW w:type="dxa" w:w="2153"/>
+          </w:tcPr>
+          <w:p>
+            <w:r/>
+            <w:r>
+              <w:t>Product Usage Specification ABE</w:t>
+            </w:r>
+          </w:p>
+        </w:tc>
+        <w:tc>
+          <w:tcPr>
+            <w:tcW w:type="dxa" w:w="2340"/>
           </w:tcPr>
           <w:p>
             <w:r/>
@@ -1187,6 +1238,9 @@
         </w:tc>
       </w:tr>
       <w:tr>
+        <w:trPr>
+          <w:cantSplit/>
+        </w:trPr>
         <w:tc>
           <w:tcPr>
             <w:tcW w:type="dxa" w:w="2434"/>
@@ -1194,7 +1248,7 @@
           <w:p>
             <w:r/>
             <w:r>
-              <w:t>Loyalty</w:t>
+              <w:t>Loyalty ABE</w:t>
             </w:r>
           </w:p>
         </w:tc>
@@ -1211,18 +1265,18 @@
         </w:tc>
         <w:tc>
           <w:tcPr>
-            <w:tcW w:type="dxa" w:w="1966"/>
-          </w:tcPr>
-          <w:p>
-            <w:r/>
-            <w:r>
-              <w:t>Loyalty Program Specification</w:t>
-            </w:r>
-          </w:p>
-        </w:tc>
-        <w:tc>
-          <w:tcPr>
-            <w:tcW w:type="dxa" w:w="2527"/>
+            <w:tcW w:type="dxa" w:w="2153"/>
+          </w:tcPr>
+          <w:p>
+            <w:r/>
+            <w:r>
+              <w:t>Loyalty Program Specification ABE</w:t>
+            </w:r>
+          </w:p>
+        </w:tc>
+        <w:tc>
+          <w:tcPr>
+            <w:tcW w:type="dxa" w:w="2340"/>
           </w:tcPr>
           <w:p>
             <w:r/>
@@ -1233,6 +1287,9 @@
         </w:tc>
       </w:tr>
       <w:tr>
+        <w:trPr>
+          <w:cantSplit/>
+        </w:trPr>
         <w:tc>
           <w:tcPr>
             <w:tcW w:type="dxa" w:w="2434"/>
@@ -1240,7 +1297,7 @@
           <w:p>
             <w:r/>
             <w:r>
-              <w:t>Party Product Specification and Offering</w:t>
+              <w:t>Party Product Specification and Offering ABE</w:t>
             </w:r>
           </w:p>
         </w:tc>
@@ -1257,16 +1314,16 @@
         </w:tc>
         <w:tc>
           <w:tcPr>
-            <w:tcW w:type="dxa" w:w="1966"/>
-          </w:tcPr>
-          <w:p>
-            <w:r/>
-            <w:r/>
-          </w:p>
-        </w:tc>
-        <w:tc>
-          <w:tcPr>
-            <w:tcW w:type="dxa" w:w="2527"/>
+            <w:tcW w:type="dxa" w:w="2153"/>
+          </w:tcPr>
+          <w:p>
+            <w:r/>
+            <w:r/>
+          </w:p>
+        </w:tc>
+        <w:tc>
+          <w:tcPr>
+            <w:tcW w:type="dxa" w:w="2340"/>
           </w:tcPr>
           <w:p>
             <w:r/>
@@ -1350,7 +1407,7 @@
               <w:rPr>
                 <w:b/>
               </w:rPr>
-              <w:t>Aggregate Function Level 1</w:t>
+              <w:t>Aggregate Function L1</w:t>
             </w:r>
           </w:p>
         </w:tc>
@@ -1364,7 +1421,7 @@
               <w:rPr>
                 <w:b/>
               </w:rPr>
-              <w:t>Aggregate Function Level 2</w:t>
+              <w:t>Aggregate Function L2</w:t>
             </w:r>
           </w:p>
         </w:tc>
@@ -1384,6 +1441,9 @@
         </w:tc>
       </w:tr>
       <w:tr>
+        <w:trPr>
+          <w:cantSplit/>
+        </w:trPr>
         <w:tc>
           <w:tcPr>
             <w:tcW w:type="dxa" w:w="1123"/>
@@ -1441,6 +1501,9 @@
         </w:tc>
       </w:tr>
       <w:tr>
+        <w:trPr>
+          <w:cantSplit/>
+        </w:trPr>
         <w:tc>
           <w:tcPr>
             <w:tcW w:type="dxa" w:w="1123"/>
@@ -1498,6 +1561,9 @@
         </w:tc>
       </w:tr>
       <w:tr>
+        <w:trPr>
+          <w:cantSplit/>
+        </w:trPr>
         <w:tc>
           <w:tcPr>
             <w:tcW w:type="dxa" w:w="1123"/>
@@ -1555,6 +1621,9 @@
         </w:tc>
       </w:tr>
       <w:tr>
+        <w:trPr>
+          <w:cantSplit/>
+        </w:trPr>
         <w:tc>
           <w:tcPr>
             <w:tcW w:type="dxa" w:w="1123"/>
@@ -1612,6 +1681,9 @@
         </w:tc>
       </w:tr>
       <w:tr>
+        <w:trPr>
+          <w:cantSplit/>
+        </w:trPr>
         <w:tc>
           <w:tcPr>
             <w:tcW w:type="dxa" w:w="1123"/>
@@ -1669,6 +1741,9 @@
         </w:tc>
       </w:tr>
       <w:tr>
+        <w:trPr>
+          <w:cantSplit/>
+        </w:trPr>
         <w:tc>
           <w:tcPr>
             <w:tcW w:type="dxa" w:w="1123"/>
@@ -1726,6 +1801,9 @@
         </w:tc>
       </w:tr>
       <w:tr>
+        <w:trPr>
+          <w:cantSplit/>
+        </w:trPr>
         <w:tc>
           <w:tcPr>
             <w:tcW w:type="dxa" w:w="1123"/>
@@ -1783,6 +1861,9 @@
         </w:tc>
       </w:tr>
       <w:tr>
+        <w:trPr>
+          <w:cantSplit/>
+        </w:trPr>
         <w:tc>
           <w:tcPr>
             <w:tcW w:type="dxa" w:w="1123"/>
@@ -1840,6 +1921,9 @@
         </w:tc>
       </w:tr>
       <w:tr>
+        <w:trPr>
+          <w:cantSplit/>
+        </w:trPr>
         <w:tc>
           <w:tcPr>
             <w:tcW w:type="dxa" w:w="1123"/>
@@ -1897,6 +1981,9 @@
         </w:tc>
       </w:tr>
       <w:tr>
+        <w:trPr>
+          <w:cantSplit/>
+        </w:trPr>
         <w:tc>
           <w:tcPr>
             <w:tcW w:type="dxa" w:w="1123"/>
@@ -1954,6 +2041,9 @@
         </w:tc>
       </w:tr>
       <w:tr>
+        <w:trPr>
+          <w:cantSplit/>
+        </w:trPr>
         <w:tc>
           <w:tcPr>
             <w:tcW w:type="dxa" w:w="1123"/>
@@ -2011,6 +2101,9 @@
         </w:tc>
       </w:tr>
       <w:tr>
+        <w:trPr>
+          <w:cantSplit/>
+        </w:trPr>
         <w:tc>
           <w:tcPr>
             <w:tcW w:type="dxa" w:w="1123"/>
@@ -2068,6 +2161,9 @@
         </w:tc>
       </w:tr>
       <w:tr>
+        <w:trPr>
+          <w:cantSplit/>
+        </w:trPr>
         <w:tc>
           <w:tcPr>
             <w:tcW w:type="dxa" w:w="1123"/>
@@ -2125,6 +2221,9 @@
         </w:tc>
       </w:tr>
       <w:tr>
+        <w:trPr>
+          <w:cantSplit/>
+        </w:trPr>
         <w:tc>
           <w:tcPr>
             <w:tcW w:type="dxa" w:w="1123"/>
@@ -2182,6 +2281,9 @@
         </w:tc>
       </w:tr>
       <w:tr>
+        <w:trPr>
+          <w:cantSplit/>
+        </w:trPr>
         <w:tc>
           <w:tcPr>
             <w:tcW w:type="dxa" w:w="1123"/>
@@ -2239,6 +2341,9 @@
         </w:tc>
       </w:tr>
       <w:tr>
+        <w:trPr>
+          <w:cantSplit/>
+        </w:trPr>
         <w:tc>
           <w:tcPr>
             <w:tcW w:type="dxa" w:w="1123"/>
@@ -2296,6 +2401,9 @@
         </w:tc>
       </w:tr>
       <w:tr>
+        <w:trPr>
+          <w:cantSplit/>
+        </w:trPr>
         <w:tc>
           <w:tcPr>
             <w:tcW w:type="dxa" w:w="1123"/>
@@ -2353,6 +2461,9 @@
         </w:tc>
       </w:tr>
       <w:tr>
+        <w:trPr>
+          <w:cantSplit/>
+        </w:trPr>
         <w:tc>
           <w:tcPr>
             <w:tcW w:type="dxa" w:w="1123"/>
@@ -2410,6 +2521,9 @@
         </w:tc>
       </w:tr>
       <w:tr>
+        <w:trPr>
+          <w:cantSplit/>
+        </w:trPr>
         <w:tc>
           <w:tcPr>
             <w:tcW w:type="dxa" w:w="1123"/>
@@ -2467,6 +2581,9 @@
         </w:tc>
       </w:tr>
       <w:tr>
+        <w:trPr>
+          <w:cantSplit/>
+        </w:trPr>
         <w:tc>
           <w:tcPr>
             <w:tcW w:type="dxa" w:w="1123"/>
@@ -2524,6 +2641,9 @@
         </w:tc>
       </w:tr>
       <w:tr>
+        <w:trPr>
+          <w:cantSplit/>
+        </w:trPr>
         <w:tc>
           <w:tcPr>
             <w:tcW w:type="dxa" w:w="1123"/>
@@ -2581,6 +2701,9 @@
         </w:tc>
       </w:tr>
       <w:tr>
+        <w:trPr>
+          <w:cantSplit/>
+        </w:trPr>
         <w:tc>
           <w:tcPr>
             <w:tcW w:type="dxa" w:w="1123"/>
@@ -2638,6 +2761,9 @@
         </w:tc>
       </w:tr>
       <w:tr>
+        <w:trPr>
+          <w:cantSplit/>
+        </w:trPr>
         <w:tc>
           <w:tcPr>
             <w:tcW w:type="dxa" w:w="1123"/>
@@ -2695,6 +2821,9 @@
         </w:tc>
       </w:tr>
       <w:tr>
+        <w:trPr>
+          <w:cantSplit/>
+        </w:trPr>
         <w:tc>
           <w:tcPr>
             <w:tcW w:type="dxa" w:w="1123"/>
@@ -2752,6 +2881,9 @@
         </w:tc>
       </w:tr>
       <w:tr>
+        <w:trPr>
+          <w:cantSplit/>
+        </w:trPr>
         <w:tc>
           <w:tcPr>
             <w:tcW w:type="dxa" w:w="1123"/>
@@ -2809,6 +2941,9 @@
         </w:tc>
       </w:tr>
       <w:tr>
+        <w:trPr>
+          <w:cantSplit/>
+        </w:trPr>
         <w:tc>
           <w:tcPr>
             <w:tcW w:type="dxa" w:w="1123"/>
@@ -2866,6 +3001,9 @@
         </w:tc>
       </w:tr>
       <w:tr>
+        <w:trPr>
+          <w:cantSplit/>
+        </w:trPr>
         <w:tc>
           <w:tcPr>
             <w:tcW w:type="dxa" w:w="1123"/>
@@ -2923,6 +3061,9 @@
         </w:tc>
       </w:tr>
       <w:tr>
+        <w:trPr>
+          <w:cantSplit/>
+        </w:trPr>
         <w:tc>
           <w:tcPr>
             <w:tcW w:type="dxa" w:w="1123"/>
@@ -2980,6 +3121,9 @@
         </w:tc>
       </w:tr>
       <w:tr>
+        <w:trPr>
+          <w:cantSplit/>
+        </w:trPr>
         <w:tc>
           <w:tcPr>
             <w:tcW w:type="dxa" w:w="1123"/>
@@ -3037,6 +3181,9 @@
         </w:tc>
       </w:tr>
       <w:tr>
+        <w:trPr>
+          <w:cantSplit/>
+        </w:trPr>
         <w:tc>
           <w:tcPr>
             <w:tcW w:type="dxa" w:w="1123"/>
@@ -3094,6 +3241,9 @@
         </w:tc>
       </w:tr>
       <w:tr>
+        <w:trPr>
+          <w:cantSplit/>
+        </w:trPr>
         <w:tc>
           <w:tcPr>
             <w:tcW w:type="dxa" w:w="1123"/>
@@ -3151,6 +3301,9 @@
         </w:tc>
       </w:tr>
       <w:tr>
+        <w:trPr>
+          <w:cantSplit/>
+        </w:trPr>
         <w:tc>
           <w:tcPr>
             <w:tcW w:type="dxa" w:w="1123"/>
@@ -3208,6 +3361,9 @@
         </w:tc>
       </w:tr>
       <w:tr>
+        <w:trPr>
+          <w:cantSplit/>
+        </w:trPr>
         <w:tc>
           <w:tcPr>
             <w:tcW w:type="dxa" w:w="1123"/>
@@ -3265,6 +3421,9 @@
         </w:tc>
       </w:tr>
       <w:tr>
+        <w:trPr>
+          <w:cantSplit/>
+        </w:trPr>
         <w:tc>
           <w:tcPr>
             <w:tcW w:type="dxa" w:w="1123"/>
@@ -3322,6 +3481,9 @@
         </w:tc>
       </w:tr>
       <w:tr>
+        <w:trPr>
+          <w:cantSplit/>
+        </w:trPr>
         <w:tc>
           <w:tcPr>
             <w:tcW w:type="dxa" w:w="1123"/>
@@ -3379,6 +3541,9 @@
         </w:tc>
       </w:tr>
       <w:tr>
+        <w:trPr>
+          <w:cantSplit/>
+        </w:trPr>
         <w:tc>
           <w:tcPr>
             <w:tcW w:type="dxa" w:w="1123"/>
@@ -3436,6 +3601,9 @@
         </w:tc>
       </w:tr>
       <w:tr>
+        <w:trPr>
+          <w:cantSplit/>
+        </w:trPr>
         <w:tc>
           <w:tcPr>
             <w:tcW w:type="dxa" w:w="1123"/>
@@ -3698,6 +3866,9 @@
         </w:tc>
       </w:tr>
       <w:tr>
+        <w:trPr>
+          <w:cantSplit/>
+        </w:trPr>
         <w:tc>
           <w:tcPr>
             <w:tcW w:type="dxa" w:w="1030"/>
@@ -3766,6 +3937,9 @@
         </w:tc>
       </w:tr>
       <w:tr>
+        <w:trPr>
+          <w:cantSplit/>
+        </w:trPr>
         <w:tc>
           <w:tcPr>
             <w:tcW w:type="dxa" w:w="1030"/>
@@ -3834,6 +4008,9 @@
         </w:tc>
       </w:tr>
       <w:tr>
+        <w:trPr>
+          <w:cantSplit/>
+        </w:trPr>
         <w:tc>
           <w:tcPr>
             <w:tcW w:type="dxa" w:w="1030"/>
@@ -3902,6 +4079,9 @@
         </w:tc>
       </w:tr>
       <w:tr>
+        <w:trPr>
+          <w:cantSplit/>
+        </w:trPr>
         <w:tc>
           <w:tcPr>
             <w:tcW w:type="dxa" w:w="1030"/>
@@ -3970,6 +4150,9 @@
         </w:tc>
       </w:tr>
       <w:tr>
+        <w:trPr>
+          <w:cantSplit/>
+        </w:trPr>
         <w:tc>
           <w:tcPr>
             <w:tcW w:type="dxa" w:w="1030"/>
@@ -4038,6 +4221,9 @@
         </w:tc>
       </w:tr>
       <w:tr>
+        <w:trPr>
+          <w:cantSplit/>
+        </w:trPr>
         <w:tc>
           <w:tcPr>
             <w:tcW w:type="dxa" w:w="1030"/>
@@ -4106,6 +4292,9 @@
         </w:tc>
       </w:tr>
       <w:tr>
+        <w:trPr>
+          <w:cantSplit/>
+        </w:trPr>
         <w:tc>
           <w:tcPr>
             <w:tcW w:type="dxa" w:w="1030"/>
@@ -4174,6 +4363,9 @@
         </w:tc>
       </w:tr>
       <w:tr>
+        <w:trPr>
+          <w:cantSplit/>
+        </w:trPr>
         <w:tc>
           <w:tcPr>
             <w:tcW w:type="dxa" w:w="1030"/>
@@ -4242,6 +4434,9 @@
         </w:tc>
       </w:tr>
       <w:tr>
+        <w:trPr>
+          <w:cantSplit/>
+        </w:trPr>
         <w:tc>
           <w:tcPr>
             <w:tcW w:type="dxa" w:w="1030"/>
@@ -4310,6 +4505,9 @@
         </w:tc>
       </w:tr>
       <w:tr>
+        <w:trPr>
+          <w:cantSplit/>
+        </w:trPr>
         <w:tc>
           <w:tcPr>
             <w:tcW w:type="dxa" w:w="1030"/>
@@ -4378,6 +4576,9 @@
         </w:tc>
       </w:tr>
       <w:tr>
+        <w:trPr>
+          <w:cantSplit/>
+        </w:trPr>
         <w:tc>
           <w:tcPr>
             <w:tcW w:type="dxa" w:w="1030"/>
@@ -4446,6 +4647,9 @@
         </w:tc>
       </w:tr>
       <w:tr>
+        <w:trPr>
+          <w:cantSplit/>
+        </w:trPr>
         <w:tc>
           <w:tcPr>
             <w:tcW w:type="dxa" w:w="1030"/>
@@ -4514,6 +4718,9 @@
         </w:tc>
       </w:tr>
       <w:tr>
+        <w:trPr>
+          <w:cantSplit/>
+        </w:trPr>
         <w:tc>
           <w:tcPr>
             <w:tcW w:type="dxa" w:w="1030"/>
@@ -4582,6 +4789,9 @@
         </w:tc>
       </w:tr>
       <w:tr>
+        <w:trPr>
+          <w:cantSplit/>
+        </w:trPr>
         <w:tc>
           <w:tcPr>
             <w:tcW w:type="dxa" w:w="1030"/>
@@ -4650,6 +4860,9 @@
         </w:tc>
       </w:tr>
       <w:tr>
+        <w:trPr>
+          <w:cantSplit/>
+        </w:trPr>
         <w:tc>
           <w:tcPr>
             <w:tcW w:type="dxa" w:w="1030"/>
@@ -4718,6 +4931,9 @@
         </w:tc>
       </w:tr>
       <w:tr>
+        <w:trPr>
+          <w:cantSplit/>
+        </w:trPr>
         <w:tc>
           <w:tcPr>
             <w:tcW w:type="dxa" w:w="1030"/>
@@ -4786,6 +5002,9 @@
         </w:tc>
       </w:tr>
       <w:tr>
+        <w:trPr>
+          <w:cantSplit/>
+        </w:trPr>
         <w:tc>
           <w:tcPr>
             <w:tcW w:type="dxa" w:w="1030"/>
@@ -5064,6 +5283,9 @@
         </w:tc>
       </w:tr>
       <w:tr>
+        <w:trPr>
+          <w:cantSplit/>
+        </w:trPr>
         <w:tc>
           <w:tcPr>
             <w:tcW w:type="dxa" w:w="936"/>
@@ -5132,6 +5354,9 @@
         </w:tc>
       </w:tr>
       <w:tr>
+        <w:trPr>
+          <w:cantSplit/>
+        </w:trPr>
         <w:tc>
           <w:tcPr>
             <w:tcW w:type="dxa" w:w="936"/>
@@ -5200,6 +5425,9 @@
         </w:tc>
       </w:tr>
       <w:tr>
+        <w:trPr>
+          <w:cantSplit/>
+        </w:trPr>
         <w:tc>
           <w:tcPr>
             <w:tcW w:type="dxa" w:w="936"/>
@@ -5268,6 +5496,9 @@
         </w:tc>
       </w:tr>
       <w:tr>
+        <w:trPr>
+          <w:cantSplit/>
+        </w:trPr>
         <w:tc>
           <w:tcPr>
             <w:tcW w:type="dxa" w:w="936"/>
@@ -5336,6 +5567,9 @@
         </w:tc>
       </w:tr>
       <w:tr>
+        <w:trPr>
+          <w:cantSplit/>
+        </w:trPr>
         <w:tc>
           <w:tcPr>
             <w:tcW w:type="dxa" w:w="936"/>
@@ -5404,6 +5638,9 @@
         </w:tc>
       </w:tr>
       <w:tr>
+        <w:trPr>
+          <w:cantSplit/>
+        </w:trPr>
         <w:tc>
           <w:tcPr>
             <w:tcW w:type="dxa" w:w="936"/>
@@ -5472,6 +5709,9 @@
         </w:tc>
       </w:tr>
       <w:tr>
+        <w:trPr>
+          <w:cantSplit/>
+        </w:trPr>
         <w:tc>
           <w:tcPr>
             <w:tcW w:type="dxa" w:w="936"/>
@@ -5540,6 +5780,9 @@
         </w:tc>
       </w:tr>
       <w:tr>
+        <w:trPr>
+          <w:cantSplit/>
+        </w:trPr>
         <w:tc>
           <w:tcPr>
             <w:tcW w:type="dxa" w:w="936"/>
@@ -5608,6 +5851,9 @@
         </w:tc>
       </w:tr>
       <w:tr>
+        <w:trPr>
+          <w:cantSplit/>
+        </w:trPr>
         <w:tc>
           <w:tcPr>
             <w:tcW w:type="dxa" w:w="936"/>
@@ -5676,6 +5922,9 @@
         </w:tc>
       </w:tr>
       <w:tr>
+        <w:trPr>
+          <w:cantSplit/>
+        </w:trPr>
         <w:tc>
           <w:tcPr>
             <w:tcW w:type="dxa" w:w="936"/>
@@ -5744,6 +5993,9 @@
         </w:tc>
       </w:tr>
       <w:tr>
+        <w:trPr>
+          <w:cantSplit/>
+        </w:trPr>
         <w:tc>
           <w:tcPr>
             <w:tcW w:type="dxa" w:w="936"/>
@@ -5812,6 +6064,9 @@
         </w:tc>
       </w:tr>
       <w:tr>
+        <w:trPr>
+          <w:cantSplit/>
+        </w:trPr>
         <w:tc>
           <w:tcPr>
             <w:tcW w:type="dxa" w:w="936"/>
@@ -5880,6 +6135,9 @@
         </w:tc>
       </w:tr>
       <w:tr>
+        <w:trPr>
+          <w:cantSplit/>
+        </w:trPr>
         <w:tc>
           <w:tcPr>
             <w:tcW w:type="dxa" w:w="936"/>
@@ -5948,6 +6206,9 @@
         </w:tc>
       </w:tr>
       <w:tr>
+        <w:trPr>
+          <w:cantSplit/>
+        </w:trPr>
         <w:tc>
           <w:tcPr>
             <w:tcW w:type="dxa" w:w="936"/>
@@ -6016,6 +6277,9 @@
         </w:tc>
       </w:tr>
       <w:tr>
+        <w:trPr>
+          <w:cantSplit/>
+        </w:trPr>
         <w:tc>
           <w:tcPr>
             <w:tcW w:type="dxa" w:w="936"/>
@@ -6084,6 +6348,9 @@
         </w:tc>
       </w:tr>
       <w:tr>
+        <w:trPr>
+          <w:cantSplit/>
+        </w:trPr>
         <w:tc>
           <w:tcPr>
             <w:tcW w:type="dxa" w:w="936"/>
@@ -6152,6 +6419,9 @@
         </w:tc>
       </w:tr>
       <w:tr>
+        <w:trPr>
+          <w:cantSplit/>
+        </w:trPr>
         <w:tc>
           <w:tcPr>
             <w:tcW w:type="dxa" w:w="936"/>
@@ -6220,6 +6490,9 @@
         </w:tc>
       </w:tr>
       <w:tr>
+        <w:trPr>
+          <w:cantSplit/>
+        </w:trPr>
         <w:tc>
           <w:tcPr>
             <w:tcW w:type="dxa" w:w="936"/>
@@ -6288,6 +6561,9 @@
         </w:tc>
       </w:tr>
       <w:tr>
+        <w:trPr>
+          <w:cantSplit/>
+        </w:trPr>
         <w:tc>
           <w:tcPr>
             <w:tcW w:type="dxa" w:w="936"/>
@@ -6356,6 +6632,9 @@
         </w:tc>
       </w:tr>
       <w:tr>
+        <w:trPr>
+          <w:cantSplit/>
+        </w:trPr>
         <w:tc>
           <w:tcPr>
             <w:tcW w:type="dxa" w:w="936"/>
@@ -6424,6 +6703,9 @@
         </w:tc>
       </w:tr>
       <w:tr>
+        <w:trPr>
+          <w:cantSplit/>
+        </w:trPr>
         <w:tc>
           <w:tcPr>
             <w:tcW w:type="dxa" w:w="936"/>
@@ -6492,6 +6774,9 @@
         </w:tc>
       </w:tr>
       <w:tr>
+        <w:trPr>
+          <w:cantSplit/>
+        </w:trPr>
         <w:tc>
           <w:tcPr>
             <w:tcW w:type="dxa" w:w="936"/>
@@ -6560,6 +6845,9 @@
         </w:tc>
       </w:tr>
       <w:tr>
+        <w:trPr>
+          <w:cantSplit/>
+        </w:trPr>
         <w:tc>
           <w:tcPr>
             <w:tcW w:type="dxa" w:w="936"/>
@@ -6628,6 +6916,9 @@
         </w:tc>
       </w:tr>
       <w:tr>
+        <w:trPr>
+          <w:cantSplit/>
+        </w:trPr>
         <w:tc>
           <w:tcPr>
             <w:tcW w:type="dxa" w:w="936"/>
@@ -6696,6 +6987,9 @@
         </w:tc>
       </w:tr>
       <w:tr>
+        <w:trPr>
+          <w:cantSplit/>
+        </w:trPr>
         <w:tc>
           <w:tcPr>
             <w:tcW w:type="dxa" w:w="936"/>
@@ -6764,6 +7058,9 @@
         </w:tc>
       </w:tr>
       <w:tr>
+        <w:trPr>
+          <w:cantSplit/>
+        </w:trPr>
         <w:tc>
           <w:tcPr>
             <w:tcW w:type="dxa" w:w="936"/>
@@ -6832,6 +7129,9 @@
         </w:tc>
       </w:tr>
       <w:tr>
+        <w:trPr>
+          <w:cantSplit/>
+        </w:trPr>
         <w:tc>
           <w:tcPr>
             <w:tcW w:type="dxa" w:w="936"/>
@@ -6900,6 +7200,9 @@
         </w:tc>
       </w:tr>
       <w:tr>
+        <w:trPr>
+          <w:cantSplit/>
+        </w:trPr>
         <w:tc>
           <w:tcPr>
             <w:tcW w:type="dxa" w:w="936"/>
@@ -6968,6 +7271,9 @@
         </w:tc>
       </w:tr>
       <w:tr>
+        <w:trPr>
+          <w:cantSplit/>
+        </w:trPr>
         <w:tc>
           <w:tcPr>
             <w:tcW w:type="dxa" w:w="936"/>
@@ -7036,6 +7342,9 @@
         </w:tc>
       </w:tr>
       <w:tr>
+        <w:trPr>
+          <w:cantSplit/>
+        </w:trPr>
         <w:tc>
           <w:tcPr>
             <w:tcW w:type="dxa" w:w="936"/>
@@ -7282,6 +7591,9 @@
         </w:tc>
       </w:tr>
       <w:tr>
+        <w:trPr>
+          <w:cantSplit/>
+        </w:trPr>
         <w:tc>
           <w:tcPr>
             <w:tcW w:type="dxa" w:w="1310"/>
@@ -7407,6 +7719,9 @@
         </w:tc>
       </w:tr>
       <w:tr>
+        <w:trPr>
+          <w:cantSplit/>
+        </w:trPr>
         <w:tc>
           <w:tcPr>
             <w:tcW w:type="dxa" w:w="1310"/>
@@ -7466,6 +7781,9 @@
         </w:tc>
       </w:tr>
       <w:tr>
+        <w:trPr>
+          <w:cantSplit/>
+        </w:trPr>
         <w:tc>
           <w:tcPr>
             <w:tcW w:type="dxa" w:w="1310"/>
@@ -7670,6 +7988,9 @@
         </w:tc>
       </w:tr>
       <w:tr>
+        <w:trPr>
+          <w:cantSplit/>
+        </w:trPr>
         <w:tc>
           <w:tcPr>
             <w:tcW w:type="dxa" w:w="1310"/>
@@ -7705,6 +8026,9 @@
         </w:tc>
       </w:tr>
       <w:tr>
+        <w:trPr>
+          <w:cantSplit/>
+        </w:trPr>
         <w:tc>
           <w:tcPr>
             <w:tcW w:type="dxa" w:w="1310"/>
@@ -7746,6 +8070,9 @@
         </w:tc>
       </w:tr>
       <w:tr>
+        <w:trPr>
+          <w:cantSplit/>
+        </w:trPr>
         <w:tc>
           <w:tcPr>
             <w:tcW w:type="dxa" w:w="1310"/>
@@ -7793,6 +8120,9 @@
         </w:tc>
       </w:tr>
       <w:tr>
+        <w:trPr>
+          <w:cantSplit/>
+        </w:trPr>
         <w:tc>
           <w:tcPr>
             <w:tcW w:type="dxa" w:w="1310"/>
@@ -7979,6 +8309,9 @@
         </w:tc>
       </w:tr>
       <w:tr>
+        <w:trPr>
+          <w:cantSplit/>
+        </w:trPr>
         <w:tc>
           <w:tcPr>
             <w:tcW w:type="dxa" w:w="5990"/>
@@ -8003,6 +8336,9 @@
         </w:tc>
       </w:tr>
       <w:tr>
+        <w:trPr>
+          <w:cantSplit/>
+        </w:trPr>
         <w:tc>
           <w:tcPr>
             <w:tcW w:type="dxa" w:w="5990"/>
@@ -8027,6 +8363,9 @@
         </w:tc>
       </w:tr>
       <w:tr>
+        <w:trPr>
+          <w:cantSplit/>
+        </w:trPr>
         <w:tc>
           <w:tcPr>
             <w:tcW w:type="dxa" w:w="5990"/>
@@ -8246,6 +8585,9 @@
         </w:tc>
       </w:tr>
       <w:tr>
+        <w:trPr>
+          <w:cantSplit/>
+        </w:trPr>
         <w:tc>
           <w:tcPr>
             <w:tcW w:type="dxa" w:w="1685"/>
@@ -8292,6 +8634,9 @@
         </w:tc>
       </w:tr>
       <w:tr>
+        <w:trPr>
+          <w:cantSplit/>
+        </w:trPr>
         <w:tc>
           <w:tcPr>
             <w:tcW w:type="dxa" w:w="1685"/>
@@ -8338,6 +8683,9 @@
         </w:tc>
       </w:tr>
       <w:tr>
+        <w:trPr>
+          <w:cantSplit/>
+        </w:trPr>
         <w:tc>
           <w:tcPr>
             <w:tcW w:type="dxa" w:w="1685"/>
@@ -8384,6 +8732,9 @@
         </w:tc>
       </w:tr>
       <w:tr>
+        <w:trPr>
+          <w:cantSplit/>
+        </w:trPr>
         <w:tc>
           <w:tcPr>
             <w:tcW w:type="dxa" w:w="1685"/>
@@ -8430,6 +8781,9 @@
         </w:tc>
       </w:tr>
       <w:tr>
+        <w:trPr>
+          <w:cantSplit/>
+        </w:trPr>
         <w:tc>
           <w:tcPr>
             <w:tcW w:type="dxa" w:w="1685"/>
@@ -8476,6 +8830,9 @@
         </w:tc>
       </w:tr>
       <w:tr>
+        <w:trPr>
+          <w:cantSplit/>
+        </w:trPr>
         <w:tc>
           <w:tcPr>
             <w:tcW w:type="dxa" w:w="1685"/>
@@ -8522,6 +8879,9 @@
         </w:tc>
       </w:tr>
       <w:tr>
+        <w:trPr>
+          <w:cantSplit/>
+        </w:trPr>
         <w:tc>
           <w:tcPr>
             <w:tcW w:type="dxa" w:w="1685"/>
@@ -8568,6 +8928,9 @@
         </w:tc>
       </w:tr>
       <w:tr>
+        <w:trPr>
+          <w:cantSplit/>
+        </w:trPr>
         <w:tc>
           <w:tcPr>
             <w:tcW w:type="dxa" w:w="1685"/>
@@ -8614,6 +8977,9 @@
         </w:tc>
       </w:tr>
       <w:tr>
+        <w:trPr>
+          <w:cantSplit/>
+        </w:trPr>
         <w:tc>
           <w:tcPr>
             <w:tcW w:type="dxa" w:w="1685"/>
@@ -8660,6 +9026,9 @@
         </w:tc>
       </w:tr>
       <w:tr>
+        <w:trPr>
+          <w:cantSplit/>
+        </w:trPr>
         <w:tc>
           <w:tcPr>
             <w:tcW w:type="dxa" w:w="1685"/>
@@ -8706,6 +9075,9 @@
         </w:tc>
       </w:tr>
       <w:tr>
+        <w:trPr>
+          <w:cantSplit/>
+        </w:trPr>
         <w:tc>
           <w:tcPr>
             <w:tcW w:type="dxa" w:w="1685"/>
@@ -8752,6 +9124,9 @@
         </w:tc>
       </w:tr>
       <w:tr>
+        <w:trPr>
+          <w:cantSplit/>
+        </w:trPr>
         <w:tc>
           <w:tcPr>
             <w:tcW w:type="dxa" w:w="1685"/>
@@ -8798,6 +9173,9 @@
         </w:tc>
       </w:tr>
       <w:tr>
+        <w:trPr>
+          <w:cantSplit/>
+        </w:trPr>
         <w:tc>
           <w:tcPr>
             <w:tcW w:type="dxa" w:w="1685"/>
@@ -8844,6 +9222,9 @@
         </w:tc>
       </w:tr>
       <w:tr>
+        <w:trPr>
+          <w:cantSplit/>
+        </w:trPr>
         <w:tc>
           <w:tcPr>
             <w:tcW w:type="dxa" w:w="1685"/>
@@ -8890,6 +9271,9 @@
         </w:tc>
       </w:tr>
       <w:tr>
+        <w:trPr>
+          <w:cantSplit/>
+        </w:trPr>
         <w:tc>
           <w:tcPr>
             <w:tcW w:type="dxa" w:w="1685"/>
@@ -9028,6 +9412,9 @@
         </w:tc>
       </w:tr>
       <w:tr>
+        <w:trPr>
+          <w:cantSplit/>
+        </w:trPr>
         <w:tc>
           <w:tcPr>
             <w:tcW w:type="dxa" w:w="1778"/>
@@ -9074,6 +9461,9 @@
         </w:tc>
       </w:tr>
       <w:tr>
+        <w:trPr>
+          <w:cantSplit/>
+        </w:trPr>
         <w:tc>
           <w:tcPr>
             <w:tcW w:type="dxa" w:w="1778"/>
@@ -9120,6 +9510,9 @@
         </w:tc>
       </w:tr>
       <w:tr>
+        <w:trPr>
+          <w:cantSplit/>
+        </w:trPr>
         <w:tc>
           <w:tcPr>
             <w:tcW w:type="dxa" w:w="1778"/>
@@ -9166,6 +9559,9 @@
         </w:tc>
       </w:tr>
       <w:tr>
+        <w:trPr>
+          <w:cantSplit/>
+        </w:trPr>
         <w:tc>
           <w:tcPr>
             <w:tcW w:type="dxa" w:w="1778"/>
@@ -9212,6 +9608,9 @@
         </w:tc>
       </w:tr>
       <w:tr>
+        <w:trPr>
+          <w:cantSplit/>
+        </w:trPr>
         <w:tc>
           <w:tcPr>
             <w:tcW w:type="dxa" w:w="1778"/>
@@ -9258,6 +9657,9 @@
         </w:tc>
       </w:tr>
       <w:tr>
+        <w:trPr>
+          <w:cantSplit/>
+        </w:trPr>
         <w:tc>
           <w:tcPr>
             <w:tcW w:type="dxa" w:w="1778"/>
@@ -9304,6 +9706,9 @@
         </w:tc>
       </w:tr>
       <w:tr>
+        <w:trPr>
+          <w:cantSplit/>
+        </w:trPr>
         <w:tc>
           <w:tcPr>
             <w:tcW w:type="dxa" w:w="1778"/>
@@ -9350,6 +9755,9 @@
         </w:tc>
       </w:tr>
       <w:tr>
+        <w:trPr>
+          <w:cantSplit/>
+        </w:trPr>
         <w:tc>
           <w:tcPr>
             <w:tcW w:type="dxa" w:w="1778"/>
@@ -9396,6 +9804,9 @@
         </w:tc>
       </w:tr>
       <w:tr>
+        <w:trPr>
+          <w:cantSplit/>
+        </w:trPr>
         <w:tc>
           <w:tcPr>
             <w:tcW w:type="dxa" w:w="1778"/>
@@ -9442,6 +9853,9 @@
         </w:tc>
       </w:tr>
       <w:tr>
+        <w:trPr>
+          <w:cantSplit/>
+        </w:trPr>
         <w:tc>
           <w:tcPr>
             <w:tcW w:type="dxa" w:w="1778"/>
@@ -9488,6 +9902,9 @@
         </w:tc>
       </w:tr>
       <w:tr>
+        <w:trPr>
+          <w:cantSplit/>
+        </w:trPr>
         <w:tc>
           <w:tcPr>
             <w:tcW w:type="dxa" w:w="1778"/>
@@ -9534,6 +9951,9 @@
         </w:tc>
       </w:tr>
       <w:tr>
+        <w:trPr>
+          <w:cantSplit/>
+        </w:trPr>
         <w:tc>
           <w:tcPr>
             <w:tcW w:type="dxa" w:w="1778"/>
@@ -9580,6 +10000,9 @@
         </w:tc>
       </w:tr>
       <w:tr>
+        <w:trPr>
+          <w:cantSplit/>
+        </w:trPr>
         <w:tc>
           <w:tcPr>
             <w:tcW w:type="dxa" w:w="1778"/>
@@ -9626,6 +10049,9 @@
         </w:tc>
       </w:tr>
       <w:tr>
+        <w:trPr>
+          <w:cantSplit/>
+        </w:trPr>
         <w:tc>
           <w:tcPr>
             <w:tcW w:type="dxa" w:w="1778"/>
@@ -9672,6 +10098,9 @@
         </w:tc>
       </w:tr>
       <w:tr>
+        <w:trPr>
+          <w:cantSplit/>
+        </w:trPr>
         <w:tc>
           <w:tcPr>
             <w:tcW w:type="dxa" w:w="1778"/>
@@ -9800,6 +10229,9 @@
         </w:tc>
       </w:tr>
       <w:tr>
+        <w:trPr>
+          <w:cantSplit/>
+        </w:trPr>
         <w:tc>
           <w:tcPr>
             <w:tcW w:type="dxa" w:w="4118"/>
@@ -9835,6 +10267,9 @@
         </w:tc>
       </w:tr>
       <w:tr>
+        <w:trPr>
+          <w:cantSplit/>
+        </w:trPr>
         <w:tc>
           <w:tcPr>
             <w:tcW w:type="dxa" w:w="4118"/>
@@ -9870,6 +10305,9 @@
         </w:tc>
       </w:tr>
       <w:tr>
+        <w:trPr>
+          <w:cantSplit/>
+        </w:trPr>
         <w:tc>
           <w:tcPr>
             <w:tcW w:type="dxa" w:w="4118"/>
@@ -9905,6 +10343,9 @@
         </w:tc>
       </w:tr>
       <w:tr>
+        <w:trPr>
+          <w:cantSplit/>
+        </w:trPr>
         <w:tc>
           <w:tcPr>
             <w:tcW w:type="dxa" w:w="4118"/>
@@ -9940,6 +10381,9 @@
         </w:tc>
       </w:tr>
       <w:tr>
+        <w:trPr>
+          <w:cantSplit/>
+        </w:trPr>
         <w:tc>
           <w:tcPr>
             <w:tcW w:type="dxa" w:w="4118"/>
@@ -9975,6 +10419,9 @@
         </w:tc>
       </w:tr>
       <w:tr>
+        <w:trPr>
+          <w:cantSplit/>
+        </w:trPr>
         <w:tc>
           <w:tcPr>
             <w:tcW w:type="dxa" w:w="4118"/>
@@ -10010,6 +10457,9 @@
         </w:tc>
       </w:tr>
       <w:tr>
+        <w:trPr>
+          <w:cantSplit/>
+        </w:trPr>
         <w:tc>
           <w:tcPr>
             <w:tcW w:type="dxa" w:w="4118"/>
@@ -10045,6 +10495,9 @@
         </w:tc>
       </w:tr>
       <w:tr>
+        <w:trPr>
+          <w:cantSplit/>
+        </w:trPr>
         <w:tc>
           <w:tcPr>
             <w:tcW w:type="dxa" w:w="4118"/>
@@ -10080,6 +10533,9 @@
         </w:tc>
       </w:tr>
       <w:tr>
+        <w:trPr>
+          <w:cantSplit/>
+        </w:trPr>
         <w:tc>
           <w:tcPr>
             <w:tcW w:type="dxa" w:w="4118"/>
@@ -10115,6 +10571,9 @@
         </w:tc>
       </w:tr>
       <w:tr>
+        <w:trPr>
+          <w:cantSplit/>
+        </w:trPr>
         <w:tc>
           <w:tcPr>
             <w:tcW w:type="dxa" w:w="4118"/>
@@ -10150,6 +10609,9 @@
         </w:tc>
       </w:tr>
       <w:tr>
+        <w:trPr>
+          <w:cantSplit/>
+        </w:trPr>
         <w:tc>
           <w:tcPr>
             <w:tcW w:type="dxa" w:w="4118"/>
@@ -10185,6 +10647,9 @@
         </w:tc>
       </w:tr>
       <w:tr>
+        <w:trPr>
+          <w:cantSplit/>
+        </w:trPr>
         <w:tc>
           <w:tcPr>
             <w:tcW w:type="dxa" w:w="4118"/>

</xml_diff>

<commit_message>
Regenerate all 34 component specification documents (#41)
Root PDF and Diagrams/.docx for every component, picking up: SID entity names in the
2.2/2.3 tables now include their ABE/BE suffix (sourced from each component's own
SID_Descriptions.md, which was updated to carry the suffix), 2.4's Aggregate Function
column headers shortened to "L1"/"L2", and the table-row/page-break fix in both the PDF
and docx builders.

Co-authored-by: Claude Sonnet 5 <noreply@anthropic.com>
</commit_message>
<xml_diff>
--- a/specifications/TMFC001-ProductCatalogManagement/Diagrams/TMFC001_Product_Catalog_Management.docx
+++ b/specifications/TMFC001-ProductCatalogManagement/Diagrams/TMFC001_Product_Catalog_Management.docx
@@ -155,6 +155,9 @@
         </w:tc>
       </w:tr>
       <w:tr>
+        <w:trPr>
+          <w:cantSplit/>
+        </w:trPr>
         <w:tc>
           <w:tcPr>
             <w:tcW w:type="dxa" w:w="2527"/>
@@ -358,6 +361,9 @@
         </w:tc>
       </w:tr>
       <w:tr>
+        <w:trPr>
+          <w:cantSplit/>
+        </w:trPr>
         <w:tc>
           <w:tcPr>
             <w:tcW w:type="dxa" w:w="1404"/>
@@ -404,6 +410,9 @@
         </w:tc>
       </w:tr>
       <w:tr>
+        <w:trPr>
+          <w:cantSplit/>
+        </w:trPr>
         <w:tc>
           <w:tcPr>
             <w:tcW w:type="dxa" w:w="1404"/>
@@ -450,6 +459,9 @@
         </w:tc>
       </w:tr>
       <w:tr>
+        <w:trPr>
+          <w:cantSplit/>
+        </w:trPr>
         <w:tc>
           <w:tcPr>
             <w:tcW w:type="dxa" w:w="1404"/>
@@ -496,6 +508,9 @@
         </w:tc>
       </w:tr>
       <w:tr>
+        <w:trPr>
+          <w:cantSplit/>
+        </w:trPr>
         <w:tc>
           <w:tcPr>
             <w:tcW w:type="dxa" w:w="1404"/>
@@ -542,6 +557,9 @@
         </w:tc>
       </w:tr>
       <w:tr>
+        <w:trPr>
+          <w:cantSplit/>
+        </w:trPr>
         <w:tc>
           <w:tcPr>
             <w:tcW w:type="dxa" w:w="1404"/>
@@ -588,6 +606,9 @@
         </w:tc>
       </w:tr>
       <w:tr>
+        <w:trPr>
+          <w:cantSplit/>
+        </w:trPr>
         <w:tc>
           <w:tcPr>
             <w:tcW w:type="dxa" w:w="1404"/>
@@ -634,6 +655,9 @@
         </w:tc>
       </w:tr>
       <w:tr>
+        <w:trPr>
+          <w:cantSplit/>
+        </w:trPr>
         <w:tc>
           <w:tcPr>
             <w:tcW w:type="dxa" w:w="1404"/>
@@ -680,6 +704,9 @@
         </w:tc>
       </w:tr>
       <w:tr>
+        <w:trPr>
+          <w:cantSplit/>
+        </w:trPr>
         <w:tc>
           <w:tcPr>
             <w:tcW w:type="dxa" w:w="1404"/>
@@ -726,6 +753,9 @@
         </w:tc>
       </w:tr>
       <w:tr>
+        <w:trPr>
+          <w:cantSplit/>
+        </w:trPr>
         <w:tc>
           <w:tcPr>
             <w:tcW w:type="dxa" w:w="1404"/>
@@ -772,6 +802,9 @@
         </w:tc>
       </w:tr>
       <w:tr>
+        <w:trPr>
+          <w:cantSplit/>
+        </w:trPr>
         <w:tc>
           <w:tcPr>
             <w:tcW w:type="dxa" w:w="1404"/>
@@ -818,6 +851,9 @@
         </w:tc>
       </w:tr>
       <w:tr>
+        <w:trPr>
+          <w:cantSplit/>
+        </w:trPr>
         <w:tc>
           <w:tcPr>
             <w:tcW w:type="dxa" w:w="1404"/>
@@ -864,6 +900,9 @@
         </w:tc>
       </w:tr>
       <w:tr>
+        <w:trPr>
+          <w:cantSplit/>
+        </w:trPr>
         <w:tc>
           <w:tcPr>
             <w:tcW w:type="dxa" w:w="1404"/>
@@ -979,7 +1018,7 @@
         </w:tc>
         <w:tc>
           <w:tcPr>
-            <w:tcW w:type="dxa" w:w="1966"/>
+            <w:tcW w:type="dxa" w:w="2153"/>
           </w:tcPr>
           <w:p>
             <w:r/>
@@ -993,7 +1032,7 @@
         </w:tc>
         <w:tc>
           <w:tcPr>
-            <w:tcW w:type="dxa" w:w="2527"/>
+            <w:tcW w:type="dxa" w:w="2340"/>
           </w:tcPr>
           <w:p>
             <w:r/>
@@ -1007,6 +1046,9 @@
         </w:tc>
       </w:tr>
       <w:tr>
+        <w:trPr>
+          <w:cantSplit/>
+        </w:trPr>
         <w:tc>
           <w:tcPr>
             <w:tcW w:type="dxa" w:w="2434"/>
@@ -1014,7 +1056,7 @@
           <w:p>
             <w:r/>
             <w:r>
-              <w:t>Product Offering Specification</w:t>
+              <w:t>Product Offering Specification ABE</w:t>
             </w:r>
           </w:p>
         </w:tc>
@@ -1031,16 +1073,16 @@
         </w:tc>
         <w:tc>
           <w:tcPr>
-            <w:tcW w:type="dxa" w:w="1966"/>
-          </w:tcPr>
-          <w:p>
-            <w:r/>
-            <w:r/>
-          </w:p>
-        </w:tc>
-        <w:tc>
-          <w:tcPr>
-            <w:tcW w:type="dxa" w:w="2527"/>
+            <w:tcW w:type="dxa" w:w="2153"/>
+          </w:tcPr>
+          <w:p>
+            <w:r/>
+            <w:r/>
+          </w:p>
+        </w:tc>
+        <w:tc>
+          <w:tcPr>
+            <w:tcW w:type="dxa" w:w="2340"/>
           </w:tcPr>
           <w:p>
             <w:r/>
@@ -1051,6 +1093,9 @@
         </w:tc>
       </w:tr>
       <w:tr>
+        <w:trPr>
+          <w:cantSplit/>
+        </w:trPr>
         <w:tc>
           <w:tcPr>
             <w:tcW w:type="dxa" w:w="2434"/>
@@ -1058,7 +1103,7 @@
           <w:p>
             <w:r/>
             <w:r>
-              <w:t>Product Specification</w:t>
+              <w:t>Product Specification ABE</w:t>
             </w:r>
           </w:p>
         </w:tc>
@@ -1075,16 +1120,16 @@
         </w:tc>
         <w:tc>
           <w:tcPr>
-            <w:tcW w:type="dxa" w:w="1966"/>
-          </w:tcPr>
-          <w:p>
-            <w:r/>
-            <w:r/>
-          </w:p>
-        </w:tc>
-        <w:tc>
-          <w:tcPr>
-            <w:tcW w:type="dxa" w:w="2527"/>
+            <w:tcW w:type="dxa" w:w="2153"/>
+          </w:tcPr>
+          <w:p>
+            <w:r/>
+            <w:r/>
+          </w:p>
+        </w:tc>
+        <w:tc>
+          <w:tcPr>
+            <w:tcW w:type="dxa" w:w="2340"/>
           </w:tcPr>
           <w:p>
             <w:r/>
@@ -1095,6 +1140,9 @@
         </w:tc>
       </w:tr>
       <w:tr>
+        <w:trPr>
+          <w:cantSplit/>
+        </w:trPr>
         <w:tc>
           <w:tcPr>
             <w:tcW w:type="dxa" w:w="2434"/>
@@ -1102,7 +1150,7 @@
           <w:p>
             <w:r/>
             <w:r>
-              <w:t>Product Configuration</w:t>
+              <w:t>Product Configuration ABE</w:t>
             </w:r>
           </w:p>
         </w:tc>
@@ -1119,18 +1167,18 @@
         </w:tc>
         <w:tc>
           <w:tcPr>
-            <w:tcW w:type="dxa" w:w="1966"/>
-          </w:tcPr>
-          <w:p>
-            <w:r/>
-            <w:r>
-              <w:t>ProductConfigSpec</w:t>
-            </w:r>
-          </w:p>
-        </w:tc>
-        <w:tc>
-          <w:tcPr>
-            <w:tcW w:type="dxa" w:w="2527"/>
+            <w:tcW w:type="dxa" w:w="2153"/>
+          </w:tcPr>
+          <w:p>
+            <w:r/>
+            <w:r>
+              <w:t>ProductConfigSpec BE</w:t>
+            </w:r>
+          </w:p>
+        </w:tc>
+        <w:tc>
+          <w:tcPr>
+            <w:tcW w:type="dxa" w:w="2340"/>
           </w:tcPr>
           <w:p>
             <w:r/>
@@ -1141,6 +1189,9 @@
         </w:tc>
       </w:tr>
       <w:tr>
+        <w:trPr>
+          <w:cantSplit/>
+        </w:trPr>
         <w:tc>
           <w:tcPr>
             <w:tcW w:type="dxa" w:w="2434"/>
@@ -1148,7 +1199,7 @@
           <w:p>
             <w:r/>
             <w:r>
-              <w:t>Product Usage</w:t>
+              <w:t>Product Usage ABE</w:t>
             </w:r>
           </w:p>
         </w:tc>
@@ -1165,18 +1216,18 @@
         </w:tc>
         <w:tc>
           <w:tcPr>
-            <w:tcW w:type="dxa" w:w="1966"/>
-          </w:tcPr>
-          <w:p>
-            <w:r/>
-            <w:r>
-              <w:t>Product Usage Specification</w:t>
-            </w:r>
-          </w:p>
-        </w:tc>
-        <w:tc>
-          <w:tcPr>
-            <w:tcW w:type="dxa" w:w="2527"/>
+            <w:tcW w:type="dxa" w:w="2153"/>
+          </w:tcPr>
+          <w:p>
+            <w:r/>
+            <w:r>
+              <w:t>Product Usage Specification ABE</w:t>
+            </w:r>
+          </w:p>
+        </w:tc>
+        <w:tc>
+          <w:tcPr>
+            <w:tcW w:type="dxa" w:w="2340"/>
           </w:tcPr>
           <w:p>
             <w:r/>
@@ -1187,6 +1238,9 @@
         </w:tc>
       </w:tr>
       <w:tr>
+        <w:trPr>
+          <w:cantSplit/>
+        </w:trPr>
         <w:tc>
           <w:tcPr>
             <w:tcW w:type="dxa" w:w="2434"/>
@@ -1194,7 +1248,7 @@
           <w:p>
             <w:r/>
             <w:r>
-              <w:t>Loyalty</w:t>
+              <w:t>Loyalty ABE</w:t>
             </w:r>
           </w:p>
         </w:tc>
@@ -1211,18 +1265,18 @@
         </w:tc>
         <w:tc>
           <w:tcPr>
-            <w:tcW w:type="dxa" w:w="1966"/>
-          </w:tcPr>
-          <w:p>
-            <w:r/>
-            <w:r>
-              <w:t>Loyalty Program Specification</w:t>
-            </w:r>
-          </w:p>
-        </w:tc>
-        <w:tc>
-          <w:tcPr>
-            <w:tcW w:type="dxa" w:w="2527"/>
+            <w:tcW w:type="dxa" w:w="2153"/>
+          </w:tcPr>
+          <w:p>
+            <w:r/>
+            <w:r>
+              <w:t>Loyalty Program Specification ABE</w:t>
+            </w:r>
+          </w:p>
+        </w:tc>
+        <w:tc>
+          <w:tcPr>
+            <w:tcW w:type="dxa" w:w="2340"/>
           </w:tcPr>
           <w:p>
             <w:r/>
@@ -1233,6 +1287,9 @@
         </w:tc>
       </w:tr>
       <w:tr>
+        <w:trPr>
+          <w:cantSplit/>
+        </w:trPr>
         <w:tc>
           <w:tcPr>
             <w:tcW w:type="dxa" w:w="2434"/>
@@ -1240,7 +1297,7 @@
           <w:p>
             <w:r/>
             <w:r>
-              <w:t>Party Product Specification and Offering</w:t>
+              <w:t>Party Product Specification and Offering ABE</w:t>
             </w:r>
           </w:p>
         </w:tc>
@@ -1257,16 +1314,16 @@
         </w:tc>
         <w:tc>
           <w:tcPr>
-            <w:tcW w:type="dxa" w:w="1966"/>
-          </w:tcPr>
-          <w:p>
-            <w:r/>
-            <w:r/>
-          </w:p>
-        </w:tc>
-        <w:tc>
-          <w:tcPr>
-            <w:tcW w:type="dxa" w:w="2527"/>
+            <w:tcW w:type="dxa" w:w="2153"/>
+          </w:tcPr>
+          <w:p>
+            <w:r/>
+            <w:r/>
+          </w:p>
+        </w:tc>
+        <w:tc>
+          <w:tcPr>
+            <w:tcW w:type="dxa" w:w="2340"/>
           </w:tcPr>
           <w:p>
             <w:r/>
@@ -1350,7 +1407,7 @@
               <w:rPr>
                 <w:b/>
               </w:rPr>
-              <w:t>Aggregate Function Level 1</w:t>
+              <w:t>Aggregate Function L1</w:t>
             </w:r>
           </w:p>
         </w:tc>
@@ -1364,7 +1421,7 @@
               <w:rPr>
                 <w:b/>
               </w:rPr>
-              <w:t>Aggregate Function Level 2</w:t>
+              <w:t>Aggregate Function L2</w:t>
             </w:r>
           </w:p>
         </w:tc>
@@ -1384,6 +1441,9 @@
         </w:tc>
       </w:tr>
       <w:tr>
+        <w:trPr>
+          <w:cantSplit/>
+        </w:trPr>
         <w:tc>
           <w:tcPr>
             <w:tcW w:type="dxa" w:w="1123"/>
@@ -1441,6 +1501,9 @@
         </w:tc>
       </w:tr>
       <w:tr>
+        <w:trPr>
+          <w:cantSplit/>
+        </w:trPr>
         <w:tc>
           <w:tcPr>
             <w:tcW w:type="dxa" w:w="1123"/>
@@ -1498,6 +1561,9 @@
         </w:tc>
       </w:tr>
       <w:tr>
+        <w:trPr>
+          <w:cantSplit/>
+        </w:trPr>
         <w:tc>
           <w:tcPr>
             <w:tcW w:type="dxa" w:w="1123"/>
@@ -1555,6 +1621,9 @@
         </w:tc>
       </w:tr>
       <w:tr>
+        <w:trPr>
+          <w:cantSplit/>
+        </w:trPr>
         <w:tc>
           <w:tcPr>
             <w:tcW w:type="dxa" w:w="1123"/>
@@ -1612,6 +1681,9 @@
         </w:tc>
       </w:tr>
       <w:tr>
+        <w:trPr>
+          <w:cantSplit/>
+        </w:trPr>
         <w:tc>
           <w:tcPr>
             <w:tcW w:type="dxa" w:w="1123"/>
@@ -1669,6 +1741,9 @@
         </w:tc>
       </w:tr>
       <w:tr>
+        <w:trPr>
+          <w:cantSplit/>
+        </w:trPr>
         <w:tc>
           <w:tcPr>
             <w:tcW w:type="dxa" w:w="1123"/>
@@ -1726,6 +1801,9 @@
         </w:tc>
       </w:tr>
       <w:tr>
+        <w:trPr>
+          <w:cantSplit/>
+        </w:trPr>
         <w:tc>
           <w:tcPr>
             <w:tcW w:type="dxa" w:w="1123"/>
@@ -1783,6 +1861,9 @@
         </w:tc>
       </w:tr>
       <w:tr>
+        <w:trPr>
+          <w:cantSplit/>
+        </w:trPr>
         <w:tc>
           <w:tcPr>
             <w:tcW w:type="dxa" w:w="1123"/>
@@ -1840,6 +1921,9 @@
         </w:tc>
       </w:tr>
       <w:tr>
+        <w:trPr>
+          <w:cantSplit/>
+        </w:trPr>
         <w:tc>
           <w:tcPr>
             <w:tcW w:type="dxa" w:w="1123"/>
@@ -1897,6 +1981,9 @@
         </w:tc>
       </w:tr>
       <w:tr>
+        <w:trPr>
+          <w:cantSplit/>
+        </w:trPr>
         <w:tc>
           <w:tcPr>
             <w:tcW w:type="dxa" w:w="1123"/>
@@ -1954,6 +2041,9 @@
         </w:tc>
       </w:tr>
       <w:tr>
+        <w:trPr>
+          <w:cantSplit/>
+        </w:trPr>
         <w:tc>
           <w:tcPr>
             <w:tcW w:type="dxa" w:w="1123"/>
@@ -2011,6 +2101,9 @@
         </w:tc>
       </w:tr>
       <w:tr>
+        <w:trPr>
+          <w:cantSplit/>
+        </w:trPr>
         <w:tc>
           <w:tcPr>
             <w:tcW w:type="dxa" w:w="1123"/>
@@ -2068,6 +2161,9 @@
         </w:tc>
       </w:tr>
       <w:tr>
+        <w:trPr>
+          <w:cantSplit/>
+        </w:trPr>
         <w:tc>
           <w:tcPr>
             <w:tcW w:type="dxa" w:w="1123"/>
@@ -2125,6 +2221,9 @@
         </w:tc>
       </w:tr>
       <w:tr>
+        <w:trPr>
+          <w:cantSplit/>
+        </w:trPr>
         <w:tc>
           <w:tcPr>
             <w:tcW w:type="dxa" w:w="1123"/>
@@ -2182,6 +2281,9 @@
         </w:tc>
       </w:tr>
       <w:tr>
+        <w:trPr>
+          <w:cantSplit/>
+        </w:trPr>
         <w:tc>
           <w:tcPr>
             <w:tcW w:type="dxa" w:w="1123"/>
@@ -2239,6 +2341,9 @@
         </w:tc>
       </w:tr>
       <w:tr>
+        <w:trPr>
+          <w:cantSplit/>
+        </w:trPr>
         <w:tc>
           <w:tcPr>
             <w:tcW w:type="dxa" w:w="1123"/>
@@ -2296,6 +2401,9 @@
         </w:tc>
       </w:tr>
       <w:tr>
+        <w:trPr>
+          <w:cantSplit/>
+        </w:trPr>
         <w:tc>
           <w:tcPr>
             <w:tcW w:type="dxa" w:w="1123"/>
@@ -2353,6 +2461,9 @@
         </w:tc>
       </w:tr>
       <w:tr>
+        <w:trPr>
+          <w:cantSplit/>
+        </w:trPr>
         <w:tc>
           <w:tcPr>
             <w:tcW w:type="dxa" w:w="1123"/>
@@ -2410,6 +2521,9 @@
         </w:tc>
       </w:tr>
       <w:tr>
+        <w:trPr>
+          <w:cantSplit/>
+        </w:trPr>
         <w:tc>
           <w:tcPr>
             <w:tcW w:type="dxa" w:w="1123"/>
@@ -2467,6 +2581,9 @@
         </w:tc>
       </w:tr>
       <w:tr>
+        <w:trPr>
+          <w:cantSplit/>
+        </w:trPr>
         <w:tc>
           <w:tcPr>
             <w:tcW w:type="dxa" w:w="1123"/>
@@ -2524,6 +2641,9 @@
         </w:tc>
       </w:tr>
       <w:tr>
+        <w:trPr>
+          <w:cantSplit/>
+        </w:trPr>
         <w:tc>
           <w:tcPr>
             <w:tcW w:type="dxa" w:w="1123"/>
@@ -2581,6 +2701,9 @@
         </w:tc>
       </w:tr>
       <w:tr>
+        <w:trPr>
+          <w:cantSplit/>
+        </w:trPr>
         <w:tc>
           <w:tcPr>
             <w:tcW w:type="dxa" w:w="1123"/>
@@ -2638,6 +2761,9 @@
         </w:tc>
       </w:tr>
       <w:tr>
+        <w:trPr>
+          <w:cantSplit/>
+        </w:trPr>
         <w:tc>
           <w:tcPr>
             <w:tcW w:type="dxa" w:w="1123"/>
@@ -2695,6 +2821,9 @@
         </w:tc>
       </w:tr>
       <w:tr>
+        <w:trPr>
+          <w:cantSplit/>
+        </w:trPr>
         <w:tc>
           <w:tcPr>
             <w:tcW w:type="dxa" w:w="1123"/>
@@ -2752,6 +2881,9 @@
         </w:tc>
       </w:tr>
       <w:tr>
+        <w:trPr>
+          <w:cantSplit/>
+        </w:trPr>
         <w:tc>
           <w:tcPr>
             <w:tcW w:type="dxa" w:w="1123"/>
@@ -2809,6 +2941,9 @@
         </w:tc>
       </w:tr>
       <w:tr>
+        <w:trPr>
+          <w:cantSplit/>
+        </w:trPr>
         <w:tc>
           <w:tcPr>
             <w:tcW w:type="dxa" w:w="1123"/>
@@ -2866,6 +3001,9 @@
         </w:tc>
       </w:tr>
       <w:tr>
+        <w:trPr>
+          <w:cantSplit/>
+        </w:trPr>
         <w:tc>
           <w:tcPr>
             <w:tcW w:type="dxa" w:w="1123"/>
@@ -2923,6 +3061,9 @@
         </w:tc>
       </w:tr>
       <w:tr>
+        <w:trPr>
+          <w:cantSplit/>
+        </w:trPr>
         <w:tc>
           <w:tcPr>
             <w:tcW w:type="dxa" w:w="1123"/>
@@ -2980,6 +3121,9 @@
         </w:tc>
       </w:tr>
       <w:tr>
+        <w:trPr>
+          <w:cantSplit/>
+        </w:trPr>
         <w:tc>
           <w:tcPr>
             <w:tcW w:type="dxa" w:w="1123"/>
@@ -3037,6 +3181,9 @@
         </w:tc>
       </w:tr>
       <w:tr>
+        <w:trPr>
+          <w:cantSplit/>
+        </w:trPr>
         <w:tc>
           <w:tcPr>
             <w:tcW w:type="dxa" w:w="1123"/>
@@ -3094,6 +3241,9 @@
         </w:tc>
       </w:tr>
       <w:tr>
+        <w:trPr>
+          <w:cantSplit/>
+        </w:trPr>
         <w:tc>
           <w:tcPr>
             <w:tcW w:type="dxa" w:w="1123"/>
@@ -3151,6 +3301,9 @@
         </w:tc>
       </w:tr>
       <w:tr>
+        <w:trPr>
+          <w:cantSplit/>
+        </w:trPr>
         <w:tc>
           <w:tcPr>
             <w:tcW w:type="dxa" w:w="1123"/>
@@ -3208,6 +3361,9 @@
         </w:tc>
       </w:tr>
       <w:tr>
+        <w:trPr>
+          <w:cantSplit/>
+        </w:trPr>
         <w:tc>
           <w:tcPr>
             <w:tcW w:type="dxa" w:w="1123"/>
@@ -3265,6 +3421,9 @@
         </w:tc>
       </w:tr>
       <w:tr>
+        <w:trPr>
+          <w:cantSplit/>
+        </w:trPr>
         <w:tc>
           <w:tcPr>
             <w:tcW w:type="dxa" w:w="1123"/>
@@ -3322,6 +3481,9 @@
         </w:tc>
       </w:tr>
       <w:tr>
+        <w:trPr>
+          <w:cantSplit/>
+        </w:trPr>
         <w:tc>
           <w:tcPr>
             <w:tcW w:type="dxa" w:w="1123"/>
@@ -3379,6 +3541,9 @@
         </w:tc>
       </w:tr>
       <w:tr>
+        <w:trPr>
+          <w:cantSplit/>
+        </w:trPr>
         <w:tc>
           <w:tcPr>
             <w:tcW w:type="dxa" w:w="1123"/>
@@ -3436,6 +3601,9 @@
         </w:tc>
       </w:tr>
       <w:tr>
+        <w:trPr>
+          <w:cantSplit/>
+        </w:trPr>
         <w:tc>
           <w:tcPr>
             <w:tcW w:type="dxa" w:w="1123"/>
@@ -3698,6 +3866,9 @@
         </w:tc>
       </w:tr>
       <w:tr>
+        <w:trPr>
+          <w:cantSplit/>
+        </w:trPr>
         <w:tc>
           <w:tcPr>
             <w:tcW w:type="dxa" w:w="1030"/>
@@ -3766,6 +3937,9 @@
         </w:tc>
       </w:tr>
       <w:tr>
+        <w:trPr>
+          <w:cantSplit/>
+        </w:trPr>
         <w:tc>
           <w:tcPr>
             <w:tcW w:type="dxa" w:w="1030"/>
@@ -3834,6 +4008,9 @@
         </w:tc>
       </w:tr>
       <w:tr>
+        <w:trPr>
+          <w:cantSplit/>
+        </w:trPr>
         <w:tc>
           <w:tcPr>
             <w:tcW w:type="dxa" w:w="1030"/>
@@ -3902,6 +4079,9 @@
         </w:tc>
       </w:tr>
       <w:tr>
+        <w:trPr>
+          <w:cantSplit/>
+        </w:trPr>
         <w:tc>
           <w:tcPr>
             <w:tcW w:type="dxa" w:w="1030"/>
@@ -3970,6 +4150,9 @@
         </w:tc>
       </w:tr>
       <w:tr>
+        <w:trPr>
+          <w:cantSplit/>
+        </w:trPr>
         <w:tc>
           <w:tcPr>
             <w:tcW w:type="dxa" w:w="1030"/>
@@ -4038,6 +4221,9 @@
         </w:tc>
       </w:tr>
       <w:tr>
+        <w:trPr>
+          <w:cantSplit/>
+        </w:trPr>
         <w:tc>
           <w:tcPr>
             <w:tcW w:type="dxa" w:w="1030"/>
@@ -4106,6 +4292,9 @@
         </w:tc>
       </w:tr>
       <w:tr>
+        <w:trPr>
+          <w:cantSplit/>
+        </w:trPr>
         <w:tc>
           <w:tcPr>
             <w:tcW w:type="dxa" w:w="1030"/>
@@ -4174,6 +4363,9 @@
         </w:tc>
       </w:tr>
       <w:tr>
+        <w:trPr>
+          <w:cantSplit/>
+        </w:trPr>
         <w:tc>
           <w:tcPr>
             <w:tcW w:type="dxa" w:w="1030"/>
@@ -4242,6 +4434,9 @@
         </w:tc>
       </w:tr>
       <w:tr>
+        <w:trPr>
+          <w:cantSplit/>
+        </w:trPr>
         <w:tc>
           <w:tcPr>
             <w:tcW w:type="dxa" w:w="1030"/>
@@ -4310,6 +4505,9 @@
         </w:tc>
       </w:tr>
       <w:tr>
+        <w:trPr>
+          <w:cantSplit/>
+        </w:trPr>
         <w:tc>
           <w:tcPr>
             <w:tcW w:type="dxa" w:w="1030"/>
@@ -4378,6 +4576,9 @@
         </w:tc>
       </w:tr>
       <w:tr>
+        <w:trPr>
+          <w:cantSplit/>
+        </w:trPr>
         <w:tc>
           <w:tcPr>
             <w:tcW w:type="dxa" w:w="1030"/>
@@ -4446,6 +4647,9 @@
         </w:tc>
       </w:tr>
       <w:tr>
+        <w:trPr>
+          <w:cantSplit/>
+        </w:trPr>
         <w:tc>
           <w:tcPr>
             <w:tcW w:type="dxa" w:w="1030"/>
@@ -4514,6 +4718,9 @@
         </w:tc>
       </w:tr>
       <w:tr>
+        <w:trPr>
+          <w:cantSplit/>
+        </w:trPr>
         <w:tc>
           <w:tcPr>
             <w:tcW w:type="dxa" w:w="1030"/>
@@ -4582,6 +4789,9 @@
         </w:tc>
       </w:tr>
       <w:tr>
+        <w:trPr>
+          <w:cantSplit/>
+        </w:trPr>
         <w:tc>
           <w:tcPr>
             <w:tcW w:type="dxa" w:w="1030"/>
@@ -4650,6 +4860,9 @@
         </w:tc>
       </w:tr>
       <w:tr>
+        <w:trPr>
+          <w:cantSplit/>
+        </w:trPr>
         <w:tc>
           <w:tcPr>
             <w:tcW w:type="dxa" w:w="1030"/>
@@ -4718,6 +4931,9 @@
         </w:tc>
       </w:tr>
       <w:tr>
+        <w:trPr>
+          <w:cantSplit/>
+        </w:trPr>
         <w:tc>
           <w:tcPr>
             <w:tcW w:type="dxa" w:w="1030"/>
@@ -4786,6 +5002,9 @@
         </w:tc>
       </w:tr>
       <w:tr>
+        <w:trPr>
+          <w:cantSplit/>
+        </w:trPr>
         <w:tc>
           <w:tcPr>
             <w:tcW w:type="dxa" w:w="1030"/>
@@ -5064,6 +5283,9 @@
         </w:tc>
       </w:tr>
       <w:tr>
+        <w:trPr>
+          <w:cantSplit/>
+        </w:trPr>
         <w:tc>
           <w:tcPr>
             <w:tcW w:type="dxa" w:w="936"/>
@@ -5132,6 +5354,9 @@
         </w:tc>
       </w:tr>
       <w:tr>
+        <w:trPr>
+          <w:cantSplit/>
+        </w:trPr>
         <w:tc>
           <w:tcPr>
             <w:tcW w:type="dxa" w:w="936"/>
@@ -5200,6 +5425,9 @@
         </w:tc>
       </w:tr>
       <w:tr>
+        <w:trPr>
+          <w:cantSplit/>
+        </w:trPr>
         <w:tc>
           <w:tcPr>
             <w:tcW w:type="dxa" w:w="936"/>
@@ -5268,6 +5496,9 @@
         </w:tc>
       </w:tr>
       <w:tr>
+        <w:trPr>
+          <w:cantSplit/>
+        </w:trPr>
         <w:tc>
           <w:tcPr>
             <w:tcW w:type="dxa" w:w="936"/>
@@ -5336,6 +5567,9 @@
         </w:tc>
       </w:tr>
       <w:tr>
+        <w:trPr>
+          <w:cantSplit/>
+        </w:trPr>
         <w:tc>
           <w:tcPr>
             <w:tcW w:type="dxa" w:w="936"/>
@@ -5404,6 +5638,9 @@
         </w:tc>
       </w:tr>
       <w:tr>
+        <w:trPr>
+          <w:cantSplit/>
+        </w:trPr>
         <w:tc>
           <w:tcPr>
             <w:tcW w:type="dxa" w:w="936"/>
@@ -5472,6 +5709,9 @@
         </w:tc>
       </w:tr>
       <w:tr>
+        <w:trPr>
+          <w:cantSplit/>
+        </w:trPr>
         <w:tc>
           <w:tcPr>
             <w:tcW w:type="dxa" w:w="936"/>
@@ -5540,6 +5780,9 @@
         </w:tc>
       </w:tr>
       <w:tr>
+        <w:trPr>
+          <w:cantSplit/>
+        </w:trPr>
         <w:tc>
           <w:tcPr>
             <w:tcW w:type="dxa" w:w="936"/>
@@ -5608,6 +5851,9 @@
         </w:tc>
       </w:tr>
       <w:tr>
+        <w:trPr>
+          <w:cantSplit/>
+        </w:trPr>
         <w:tc>
           <w:tcPr>
             <w:tcW w:type="dxa" w:w="936"/>
@@ -5676,6 +5922,9 @@
         </w:tc>
       </w:tr>
       <w:tr>
+        <w:trPr>
+          <w:cantSplit/>
+        </w:trPr>
         <w:tc>
           <w:tcPr>
             <w:tcW w:type="dxa" w:w="936"/>
@@ -5744,6 +5993,9 @@
         </w:tc>
       </w:tr>
       <w:tr>
+        <w:trPr>
+          <w:cantSplit/>
+        </w:trPr>
         <w:tc>
           <w:tcPr>
             <w:tcW w:type="dxa" w:w="936"/>
@@ -5812,6 +6064,9 @@
         </w:tc>
       </w:tr>
       <w:tr>
+        <w:trPr>
+          <w:cantSplit/>
+        </w:trPr>
         <w:tc>
           <w:tcPr>
             <w:tcW w:type="dxa" w:w="936"/>
@@ -5880,6 +6135,9 @@
         </w:tc>
       </w:tr>
       <w:tr>
+        <w:trPr>
+          <w:cantSplit/>
+        </w:trPr>
         <w:tc>
           <w:tcPr>
             <w:tcW w:type="dxa" w:w="936"/>
@@ -5948,6 +6206,9 @@
         </w:tc>
       </w:tr>
       <w:tr>
+        <w:trPr>
+          <w:cantSplit/>
+        </w:trPr>
         <w:tc>
           <w:tcPr>
             <w:tcW w:type="dxa" w:w="936"/>
@@ -6016,6 +6277,9 @@
         </w:tc>
       </w:tr>
       <w:tr>
+        <w:trPr>
+          <w:cantSplit/>
+        </w:trPr>
         <w:tc>
           <w:tcPr>
             <w:tcW w:type="dxa" w:w="936"/>
@@ -6084,6 +6348,9 @@
         </w:tc>
       </w:tr>
       <w:tr>
+        <w:trPr>
+          <w:cantSplit/>
+        </w:trPr>
         <w:tc>
           <w:tcPr>
             <w:tcW w:type="dxa" w:w="936"/>
@@ -6152,6 +6419,9 @@
         </w:tc>
       </w:tr>
       <w:tr>
+        <w:trPr>
+          <w:cantSplit/>
+        </w:trPr>
         <w:tc>
           <w:tcPr>
             <w:tcW w:type="dxa" w:w="936"/>
@@ -6220,6 +6490,9 @@
         </w:tc>
       </w:tr>
       <w:tr>
+        <w:trPr>
+          <w:cantSplit/>
+        </w:trPr>
         <w:tc>
           <w:tcPr>
             <w:tcW w:type="dxa" w:w="936"/>
@@ -6288,6 +6561,9 @@
         </w:tc>
       </w:tr>
       <w:tr>
+        <w:trPr>
+          <w:cantSplit/>
+        </w:trPr>
         <w:tc>
           <w:tcPr>
             <w:tcW w:type="dxa" w:w="936"/>
@@ -6356,6 +6632,9 @@
         </w:tc>
       </w:tr>
       <w:tr>
+        <w:trPr>
+          <w:cantSplit/>
+        </w:trPr>
         <w:tc>
           <w:tcPr>
             <w:tcW w:type="dxa" w:w="936"/>
@@ -6424,6 +6703,9 @@
         </w:tc>
       </w:tr>
       <w:tr>
+        <w:trPr>
+          <w:cantSplit/>
+        </w:trPr>
         <w:tc>
           <w:tcPr>
             <w:tcW w:type="dxa" w:w="936"/>
@@ -6492,6 +6774,9 @@
         </w:tc>
       </w:tr>
       <w:tr>
+        <w:trPr>
+          <w:cantSplit/>
+        </w:trPr>
         <w:tc>
           <w:tcPr>
             <w:tcW w:type="dxa" w:w="936"/>
@@ -6560,6 +6845,9 @@
         </w:tc>
       </w:tr>
       <w:tr>
+        <w:trPr>
+          <w:cantSplit/>
+        </w:trPr>
         <w:tc>
           <w:tcPr>
             <w:tcW w:type="dxa" w:w="936"/>
@@ -6628,6 +6916,9 @@
         </w:tc>
       </w:tr>
       <w:tr>
+        <w:trPr>
+          <w:cantSplit/>
+        </w:trPr>
         <w:tc>
           <w:tcPr>
             <w:tcW w:type="dxa" w:w="936"/>
@@ -6696,6 +6987,9 @@
         </w:tc>
       </w:tr>
       <w:tr>
+        <w:trPr>
+          <w:cantSplit/>
+        </w:trPr>
         <w:tc>
           <w:tcPr>
             <w:tcW w:type="dxa" w:w="936"/>
@@ -6764,6 +7058,9 @@
         </w:tc>
       </w:tr>
       <w:tr>
+        <w:trPr>
+          <w:cantSplit/>
+        </w:trPr>
         <w:tc>
           <w:tcPr>
             <w:tcW w:type="dxa" w:w="936"/>
@@ -6832,6 +7129,9 @@
         </w:tc>
       </w:tr>
       <w:tr>
+        <w:trPr>
+          <w:cantSplit/>
+        </w:trPr>
         <w:tc>
           <w:tcPr>
             <w:tcW w:type="dxa" w:w="936"/>
@@ -6900,6 +7200,9 @@
         </w:tc>
       </w:tr>
       <w:tr>
+        <w:trPr>
+          <w:cantSplit/>
+        </w:trPr>
         <w:tc>
           <w:tcPr>
             <w:tcW w:type="dxa" w:w="936"/>
@@ -6968,6 +7271,9 @@
         </w:tc>
       </w:tr>
       <w:tr>
+        <w:trPr>
+          <w:cantSplit/>
+        </w:trPr>
         <w:tc>
           <w:tcPr>
             <w:tcW w:type="dxa" w:w="936"/>
@@ -7036,6 +7342,9 @@
         </w:tc>
       </w:tr>
       <w:tr>
+        <w:trPr>
+          <w:cantSplit/>
+        </w:trPr>
         <w:tc>
           <w:tcPr>
             <w:tcW w:type="dxa" w:w="936"/>
@@ -7282,6 +7591,9 @@
         </w:tc>
       </w:tr>
       <w:tr>
+        <w:trPr>
+          <w:cantSplit/>
+        </w:trPr>
         <w:tc>
           <w:tcPr>
             <w:tcW w:type="dxa" w:w="1310"/>
@@ -7407,6 +7719,9 @@
         </w:tc>
       </w:tr>
       <w:tr>
+        <w:trPr>
+          <w:cantSplit/>
+        </w:trPr>
         <w:tc>
           <w:tcPr>
             <w:tcW w:type="dxa" w:w="1310"/>
@@ -7466,6 +7781,9 @@
         </w:tc>
       </w:tr>
       <w:tr>
+        <w:trPr>
+          <w:cantSplit/>
+        </w:trPr>
         <w:tc>
           <w:tcPr>
             <w:tcW w:type="dxa" w:w="1310"/>
@@ -7670,6 +7988,9 @@
         </w:tc>
       </w:tr>
       <w:tr>
+        <w:trPr>
+          <w:cantSplit/>
+        </w:trPr>
         <w:tc>
           <w:tcPr>
             <w:tcW w:type="dxa" w:w="1310"/>
@@ -7705,6 +8026,9 @@
         </w:tc>
       </w:tr>
       <w:tr>
+        <w:trPr>
+          <w:cantSplit/>
+        </w:trPr>
         <w:tc>
           <w:tcPr>
             <w:tcW w:type="dxa" w:w="1310"/>
@@ -7746,6 +8070,9 @@
         </w:tc>
       </w:tr>
       <w:tr>
+        <w:trPr>
+          <w:cantSplit/>
+        </w:trPr>
         <w:tc>
           <w:tcPr>
             <w:tcW w:type="dxa" w:w="1310"/>
@@ -7793,6 +8120,9 @@
         </w:tc>
       </w:tr>
       <w:tr>
+        <w:trPr>
+          <w:cantSplit/>
+        </w:trPr>
         <w:tc>
           <w:tcPr>
             <w:tcW w:type="dxa" w:w="1310"/>
@@ -7979,6 +8309,9 @@
         </w:tc>
       </w:tr>
       <w:tr>
+        <w:trPr>
+          <w:cantSplit/>
+        </w:trPr>
         <w:tc>
           <w:tcPr>
             <w:tcW w:type="dxa" w:w="5990"/>
@@ -8003,6 +8336,9 @@
         </w:tc>
       </w:tr>
       <w:tr>
+        <w:trPr>
+          <w:cantSplit/>
+        </w:trPr>
         <w:tc>
           <w:tcPr>
             <w:tcW w:type="dxa" w:w="5990"/>
@@ -8027,6 +8363,9 @@
         </w:tc>
       </w:tr>
       <w:tr>
+        <w:trPr>
+          <w:cantSplit/>
+        </w:trPr>
         <w:tc>
           <w:tcPr>
             <w:tcW w:type="dxa" w:w="5990"/>
@@ -8246,6 +8585,9 @@
         </w:tc>
       </w:tr>
       <w:tr>
+        <w:trPr>
+          <w:cantSplit/>
+        </w:trPr>
         <w:tc>
           <w:tcPr>
             <w:tcW w:type="dxa" w:w="1685"/>
@@ -8292,6 +8634,9 @@
         </w:tc>
       </w:tr>
       <w:tr>
+        <w:trPr>
+          <w:cantSplit/>
+        </w:trPr>
         <w:tc>
           <w:tcPr>
             <w:tcW w:type="dxa" w:w="1685"/>
@@ -8338,6 +8683,9 @@
         </w:tc>
       </w:tr>
       <w:tr>
+        <w:trPr>
+          <w:cantSplit/>
+        </w:trPr>
         <w:tc>
           <w:tcPr>
             <w:tcW w:type="dxa" w:w="1685"/>
@@ -8384,6 +8732,9 @@
         </w:tc>
       </w:tr>
       <w:tr>
+        <w:trPr>
+          <w:cantSplit/>
+        </w:trPr>
         <w:tc>
           <w:tcPr>
             <w:tcW w:type="dxa" w:w="1685"/>
@@ -8430,6 +8781,9 @@
         </w:tc>
       </w:tr>
       <w:tr>
+        <w:trPr>
+          <w:cantSplit/>
+        </w:trPr>
         <w:tc>
           <w:tcPr>
             <w:tcW w:type="dxa" w:w="1685"/>
@@ -8476,6 +8830,9 @@
         </w:tc>
       </w:tr>
       <w:tr>
+        <w:trPr>
+          <w:cantSplit/>
+        </w:trPr>
         <w:tc>
           <w:tcPr>
             <w:tcW w:type="dxa" w:w="1685"/>
@@ -8522,6 +8879,9 @@
         </w:tc>
       </w:tr>
       <w:tr>
+        <w:trPr>
+          <w:cantSplit/>
+        </w:trPr>
         <w:tc>
           <w:tcPr>
             <w:tcW w:type="dxa" w:w="1685"/>
@@ -8568,6 +8928,9 @@
         </w:tc>
       </w:tr>
       <w:tr>
+        <w:trPr>
+          <w:cantSplit/>
+        </w:trPr>
         <w:tc>
           <w:tcPr>
             <w:tcW w:type="dxa" w:w="1685"/>
@@ -8614,6 +8977,9 @@
         </w:tc>
       </w:tr>
       <w:tr>
+        <w:trPr>
+          <w:cantSplit/>
+        </w:trPr>
         <w:tc>
           <w:tcPr>
             <w:tcW w:type="dxa" w:w="1685"/>
@@ -8660,6 +9026,9 @@
         </w:tc>
       </w:tr>
       <w:tr>
+        <w:trPr>
+          <w:cantSplit/>
+        </w:trPr>
         <w:tc>
           <w:tcPr>
             <w:tcW w:type="dxa" w:w="1685"/>
@@ -8706,6 +9075,9 @@
         </w:tc>
       </w:tr>
       <w:tr>
+        <w:trPr>
+          <w:cantSplit/>
+        </w:trPr>
         <w:tc>
           <w:tcPr>
             <w:tcW w:type="dxa" w:w="1685"/>
@@ -8752,6 +9124,9 @@
         </w:tc>
       </w:tr>
       <w:tr>
+        <w:trPr>
+          <w:cantSplit/>
+        </w:trPr>
         <w:tc>
           <w:tcPr>
             <w:tcW w:type="dxa" w:w="1685"/>
@@ -8798,6 +9173,9 @@
         </w:tc>
       </w:tr>
       <w:tr>
+        <w:trPr>
+          <w:cantSplit/>
+        </w:trPr>
         <w:tc>
           <w:tcPr>
             <w:tcW w:type="dxa" w:w="1685"/>
@@ -8844,6 +9222,9 @@
         </w:tc>
       </w:tr>
       <w:tr>
+        <w:trPr>
+          <w:cantSplit/>
+        </w:trPr>
         <w:tc>
           <w:tcPr>
             <w:tcW w:type="dxa" w:w="1685"/>
@@ -8890,6 +9271,9 @@
         </w:tc>
       </w:tr>
       <w:tr>
+        <w:trPr>
+          <w:cantSplit/>
+        </w:trPr>
         <w:tc>
           <w:tcPr>
             <w:tcW w:type="dxa" w:w="1685"/>
@@ -9028,6 +9412,9 @@
         </w:tc>
       </w:tr>
       <w:tr>
+        <w:trPr>
+          <w:cantSplit/>
+        </w:trPr>
         <w:tc>
           <w:tcPr>
             <w:tcW w:type="dxa" w:w="1778"/>
@@ -9074,6 +9461,9 @@
         </w:tc>
       </w:tr>
       <w:tr>
+        <w:trPr>
+          <w:cantSplit/>
+        </w:trPr>
         <w:tc>
           <w:tcPr>
             <w:tcW w:type="dxa" w:w="1778"/>
@@ -9120,6 +9510,9 @@
         </w:tc>
       </w:tr>
       <w:tr>
+        <w:trPr>
+          <w:cantSplit/>
+        </w:trPr>
         <w:tc>
           <w:tcPr>
             <w:tcW w:type="dxa" w:w="1778"/>
@@ -9166,6 +9559,9 @@
         </w:tc>
       </w:tr>
       <w:tr>
+        <w:trPr>
+          <w:cantSplit/>
+        </w:trPr>
         <w:tc>
           <w:tcPr>
             <w:tcW w:type="dxa" w:w="1778"/>
@@ -9212,6 +9608,9 @@
         </w:tc>
       </w:tr>
       <w:tr>
+        <w:trPr>
+          <w:cantSplit/>
+        </w:trPr>
         <w:tc>
           <w:tcPr>
             <w:tcW w:type="dxa" w:w="1778"/>
@@ -9258,6 +9657,9 @@
         </w:tc>
       </w:tr>
       <w:tr>
+        <w:trPr>
+          <w:cantSplit/>
+        </w:trPr>
         <w:tc>
           <w:tcPr>
             <w:tcW w:type="dxa" w:w="1778"/>
@@ -9304,6 +9706,9 @@
         </w:tc>
       </w:tr>
       <w:tr>
+        <w:trPr>
+          <w:cantSplit/>
+        </w:trPr>
         <w:tc>
           <w:tcPr>
             <w:tcW w:type="dxa" w:w="1778"/>
@@ -9350,6 +9755,9 @@
         </w:tc>
       </w:tr>
       <w:tr>
+        <w:trPr>
+          <w:cantSplit/>
+        </w:trPr>
         <w:tc>
           <w:tcPr>
             <w:tcW w:type="dxa" w:w="1778"/>
@@ -9396,6 +9804,9 @@
         </w:tc>
       </w:tr>
       <w:tr>
+        <w:trPr>
+          <w:cantSplit/>
+        </w:trPr>
         <w:tc>
           <w:tcPr>
             <w:tcW w:type="dxa" w:w="1778"/>
@@ -9442,6 +9853,9 @@
         </w:tc>
       </w:tr>
       <w:tr>
+        <w:trPr>
+          <w:cantSplit/>
+        </w:trPr>
         <w:tc>
           <w:tcPr>
             <w:tcW w:type="dxa" w:w="1778"/>
@@ -9488,6 +9902,9 @@
         </w:tc>
       </w:tr>
       <w:tr>
+        <w:trPr>
+          <w:cantSplit/>
+        </w:trPr>
         <w:tc>
           <w:tcPr>
             <w:tcW w:type="dxa" w:w="1778"/>
@@ -9534,6 +9951,9 @@
         </w:tc>
       </w:tr>
       <w:tr>
+        <w:trPr>
+          <w:cantSplit/>
+        </w:trPr>
         <w:tc>
           <w:tcPr>
             <w:tcW w:type="dxa" w:w="1778"/>
@@ -9580,6 +10000,9 @@
         </w:tc>
       </w:tr>
       <w:tr>
+        <w:trPr>
+          <w:cantSplit/>
+        </w:trPr>
         <w:tc>
           <w:tcPr>
             <w:tcW w:type="dxa" w:w="1778"/>
@@ -9626,6 +10049,9 @@
         </w:tc>
       </w:tr>
       <w:tr>
+        <w:trPr>
+          <w:cantSplit/>
+        </w:trPr>
         <w:tc>
           <w:tcPr>
             <w:tcW w:type="dxa" w:w="1778"/>
@@ -9672,6 +10098,9 @@
         </w:tc>
       </w:tr>
       <w:tr>
+        <w:trPr>
+          <w:cantSplit/>
+        </w:trPr>
         <w:tc>
           <w:tcPr>
             <w:tcW w:type="dxa" w:w="1778"/>
@@ -9800,6 +10229,9 @@
         </w:tc>
       </w:tr>
       <w:tr>
+        <w:trPr>
+          <w:cantSplit/>
+        </w:trPr>
         <w:tc>
           <w:tcPr>
             <w:tcW w:type="dxa" w:w="4118"/>
@@ -9835,6 +10267,9 @@
         </w:tc>
       </w:tr>
       <w:tr>
+        <w:trPr>
+          <w:cantSplit/>
+        </w:trPr>
         <w:tc>
           <w:tcPr>
             <w:tcW w:type="dxa" w:w="4118"/>
@@ -9870,6 +10305,9 @@
         </w:tc>
       </w:tr>
       <w:tr>
+        <w:trPr>
+          <w:cantSplit/>
+        </w:trPr>
         <w:tc>
           <w:tcPr>
             <w:tcW w:type="dxa" w:w="4118"/>
@@ -9905,6 +10343,9 @@
         </w:tc>
       </w:tr>
       <w:tr>
+        <w:trPr>
+          <w:cantSplit/>
+        </w:trPr>
         <w:tc>
           <w:tcPr>
             <w:tcW w:type="dxa" w:w="4118"/>
@@ -9940,6 +10381,9 @@
         </w:tc>
       </w:tr>
       <w:tr>
+        <w:trPr>
+          <w:cantSplit/>
+        </w:trPr>
         <w:tc>
           <w:tcPr>
             <w:tcW w:type="dxa" w:w="4118"/>
@@ -9975,6 +10419,9 @@
         </w:tc>
       </w:tr>
       <w:tr>
+        <w:trPr>
+          <w:cantSplit/>
+        </w:trPr>
         <w:tc>
           <w:tcPr>
             <w:tcW w:type="dxa" w:w="4118"/>
@@ -10010,6 +10457,9 @@
         </w:tc>
       </w:tr>
       <w:tr>
+        <w:trPr>
+          <w:cantSplit/>
+        </w:trPr>
         <w:tc>
           <w:tcPr>
             <w:tcW w:type="dxa" w:w="4118"/>
@@ -10045,6 +10495,9 @@
         </w:tc>
       </w:tr>
       <w:tr>
+        <w:trPr>
+          <w:cantSplit/>
+        </w:trPr>
         <w:tc>
           <w:tcPr>
             <w:tcW w:type="dxa" w:w="4118"/>
@@ -10080,6 +10533,9 @@
         </w:tc>
       </w:tr>
       <w:tr>
+        <w:trPr>
+          <w:cantSplit/>
+        </w:trPr>
         <w:tc>
           <w:tcPr>
             <w:tcW w:type="dxa" w:w="4118"/>
@@ -10115,6 +10571,9 @@
         </w:tc>
       </w:tr>
       <w:tr>
+        <w:trPr>
+          <w:cantSplit/>
+        </w:trPr>
         <w:tc>
           <w:tcPr>
             <w:tcW w:type="dxa" w:w="4118"/>
@@ -10150,6 +10609,9 @@
         </w:tc>
       </w:tr>
       <w:tr>
+        <w:trPr>
+          <w:cantSplit/>
+        </w:trPr>
         <w:tc>
           <w:tcPr>
             <w:tcW w:type="dxa" w:w="4118"/>
@@ -10185,6 +10647,9 @@
         </w:tc>
       </w:tr>
       <w:tr>
+        <w:trPr>
+          <w:cantSplit/>
+        </w:trPr>
         <w:tc>
           <w:tcPr>
             <w:tcW w:type="dxa" w:w="4118"/>

</xml_diff>